<commit_message>
Update story bible: use role labels (the Psychologist / the Inmate) instead of character names
Co-Authored-By: Claude Opus 4.8 (1M context) <noreply@anthropic.com>
Claude-Session: https://claude.ai/code/session_01XPJW3cWNtKJW2iRHbtxJrM
</commit_message>
<xml_diff>
--- a/The-Prison-Series-Story-Bible.docx
+++ b/The-Prison-Series-Story-Bible.docx
@@ -193,7 +193,7 @@
         <w:pStyle w:val="Heading3"/>
       </w:pPr>
       <w:r>
-        <w:t xml:space="preserve">Dr. Elias Crane — the Psychologist (antihero / “morally black” MMC)</w:t>
+        <w:t xml:space="preserve">The Psychologist (antihero / “morally black” MMC)</w:t>
       </w:r>
     </w:p>
     <w:p>
@@ -240,20 +240,20 @@
         <w:pStyle w:val="Heading3"/>
       </w:pPr>
       <w:r>
-        <w:t xml:space="preserve">Silas Vane — the Inmate (love interest / captive)</w:t>
-      </w:r>
-    </w:p>
-    <w:p>
-      <w:pPr>
-        <w:pStyle w:val="ListParagraph"/>
-        <w:numPr>
-          <w:ilvl w:val="0"/>
-          <w:numId w:val="2"/>
-        </w:numPr>
-        <w:spacing w:after="70" w:line="270"/>
-      </w:pPr>
-      <w:r>
-        <w:t xml:space="preserve">Late 20s. Convicted of murder. Defiant, sharp, refuses to perform for the system — which is exactly what hooks Elias.</w:t>
+        <w:t xml:space="preserve">The Inmate (love interest / captive)</w:t>
+      </w:r>
+    </w:p>
+    <w:p>
+      <w:pPr>
+        <w:pStyle w:val="ListParagraph"/>
+        <w:numPr>
+          <w:ilvl w:val="0"/>
+          <w:numId w:val="2"/>
+        </w:numPr>
+        <w:spacing w:after="70" w:line="270"/>
+      </w:pPr>
+      <w:r>
+        <w:t xml:space="preserve">Late 20s. Convicted of murder. Defiant, sharp, refuses to perform for the system — which is exactly what hooks the psychologist.</w:t>
       </w:r>
     </w:p>
     <w:p>
@@ -287,33 +287,33 @@
         <w:spacing w:after="70" w:line="270"/>
       </w:pPr>
       <w:r>
-        <w:t xml:space="preserve">The Employer — the off-page power paying Elias; the real villain and the bridge to the wider series.</w:t>
-      </w:r>
-    </w:p>
-    <w:p>
-      <w:pPr>
-        <w:pStyle w:val="ListParagraph"/>
-        <w:numPr>
-          <w:ilvl w:val="0"/>
-          <w:numId w:val="2"/>
-        </w:numPr>
-        <w:spacing w:after="70" w:line="270"/>
-      </w:pPr>
-      <w:r>
-        <w:t xml:space="preserve">CO Hardesty — a corrections officer who clocks the dynamic and becomes kill #2. Embodiment of “custody vs. clinical” friction.</w:t>
-      </w:r>
-    </w:p>
-    <w:p>
-      <w:pPr>
-        <w:pStyle w:val="ListParagraph"/>
-        <w:numPr>
-          <w:ilvl w:val="0"/>
-          <w:numId w:val="2"/>
-        </w:numPr>
-        <w:spacing w:after="70" w:line="270"/>
-      </w:pPr>
-      <w:r>
-        <w:t xml:space="preserve">The Attacker — the inmate whose assault on Silas triggers kill #1.</w:t>
+        <w:t xml:space="preserve">The Employer — the off-page power paying the psychologist; the real villain and the bridge to the wider series.</w:t>
+      </w:r>
+    </w:p>
+    <w:p>
+      <w:pPr>
+        <w:pStyle w:val="ListParagraph"/>
+        <w:numPr>
+          <w:ilvl w:val="0"/>
+          <w:numId w:val="2"/>
+        </w:numPr>
+        <w:spacing w:after="70" w:line="270"/>
+      </w:pPr>
+      <w:r>
+        <w:t xml:space="preserve">The Officer — a corrections officer who clocks the dynamic and becomes kill #2. Embodiment of the “custody vs. clinical” friction.</w:t>
+      </w:r>
+    </w:p>
+    <w:p>
+      <w:pPr>
+        <w:pStyle w:val="ListParagraph"/>
+        <w:numPr>
+          <w:ilvl w:val="0"/>
+          <w:numId w:val="2"/>
+        </w:numPr>
+        <w:spacing w:after="70" w:line="270"/>
+      </w:pPr>
+      <w:r>
+        <w:t xml:space="preserve">The Attacker — the inmate whose assault on the inmate-lead triggers kill #1.</w:t>
       </w:r>
     </w:p>
     <w:p>
@@ -345,7 +345,7 @@
         <w:t xml:space="preserve">The setup: </w:t>
       </w:r>
       <w:r>
-        <w:t xml:space="preserve">Elias takes the prison contract because the Employer is paying him to get inside Silas’s head — to extract something (a name, a location, evidence) or to build the case that Silas is criminally insane so he disappears into a secure facility forever. The personal hook: Silas is convicted of killing someone Elias knew. Elias tells himself this is revenge.</w:t>
+        <w:t xml:space="preserve">The psychologist takes the prison contract because the Employer is paying him to get inside the inmate’s head — to extract something (a name, a location, evidence) or to build the case that the inmate is criminally insane so he disappears into a secure facility forever. The personal hook: the inmate is convicted of killing someone the psychologist knew. The psychologist tells himself this is revenge.</w:t>
       </w:r>
     </w:p>
     <w:p>
@@ -361,7 +361,7 @@
         <w:t xml:space="preserve">The twist (Act 4): </w:t>
       </w:r>
       <w:r>
-        <w:t xml:space="preserve">Silas is innocent — or the killing was justified — and the Employer is the real killer (or the dead man’s crime family covering it up). Now Elias’s two motives collide: the revenge was aimed at the wrong man, and the people paying him are the ones who deserve it.</w:t>
+        <w:t xml:space="preserve">The inmate is innocent — or the killing was justified — and the Employer is the real killer (or the dead man’s crime family covering it up). Now the psychologist’s two motives collide: the revenge was aimed at the wrong man, and the people paying him are the ones who deserve it.</w:t>
       </w:r>
     </w:p>
     <w:p>
@@ -389,7 +389,7 @@
         <w:spacing w:after="140" w:line="276"/>
       </w:pPr>
       <w:r>
-        <w:t xml:space="preserve">Here’s the fix for the part you’re stuck on. The mistake is imagining the psychologist “running a unit.” He doesn’t — and he doesn’t need to. A forensic psychologist’s real power is narrative: he writes the report that decides what kind of prisoner Silas is, and that paperwork physically relocates Silas into environments with progressively fewer witnesses and more clinical control. The “forensic unit” isn’t a place Elias commands; it’s the destination his diagnoses engineer.</w:t>
+        <w:t xml:space="preserve">Here’s the fix for the part you’re stuck on. The mistake is imagining the psychologist “running a unit.” He doesn’t — and he doesn’t need to. A forensic psychologist’s real power is narrative: he writes the report that decides what kind of prisoner the inmate is, and that paperwork physically relocates the inmate into environments with progressively fewer witnesses and more clinical control. The “forensic unit” isn’t a place he commands; it’s the destination his diagnoses engineer.</w:t>
       </w:r>
     </w:p>
     <w:p>
@@ -413,7 +413,7 @@
         <w:t xml:space="preserve">It weaponises his actual job. </w:t>
       </w:r>
       <w:r>
-        <w:t xml:space="preserve">Everything Elias does to isolate Silas looks, on paper, like good clinical practice. The reader sees coercion; the record shows treatment. That gap is the engine of the dubcon and the horror.</w:t>
+        <w:t xml:space="preserve">Everything the psychologist does to isolate the inmate looks, on paper, like good clinical practice. The reader sees coercion; the record shows treatment. That gap is the engine of the dubcon and the horror.</w:t>
       </w:r>
     </w:p>
     <w:p>
@@ -426,10 +426,10 @@
           <w:bCs/>
           <w:color w:val="7B1E22"/>
         </w:rPr>
-        <w:t xml:space="preserve">It explains the CO conflict and the second murder. </w:t>
-      </w:r>
-      <w:r>
-        <w:t xml:space="preserve">Prisons run on a real institutional tension between CUSTODY staff (the COs, who control bodies and discipline) and CLINICAL staff (psych/medical, who control diagnoses and meds). When CO Hardesty throws Silas in solitary, that is custody overriding clinical — a direct challenge to Elias’s authority over his ‘patient.’ Elias killing him is him reasserting control. The theme and the plot lock together.</w:t>
+        <w:t xml:space="preserve">It explains the officer conflict and the second murder. </w:t>
+      </w:r>
+      <w:r>
+        <w:t xml:space="preserve">Prisons run on a real institutional tension between CUSTODY staff (the officers, who control bodies and discipline) and CLINICAL staff (psych/medical, who control diagnoses and meds). When the officer throws the inmate in solitary, that is custody overriding clinical — a direct challenge to the psychologist’s authority over his ‘patient.’ The psychologist killing him is him reasserting control. The theme and the plot lock together.</w:t>
       </w:r>
     </w:p>
     <w:p>
@@ -445,7 +445,7 @@
         <w:t xml:space="preserve">It powers the captivity escalation. </w:t>
       </w:r>
       <w:r>
-        <w:t xml:space="preserve">Each transfer is a tighter cage with Elias closer to the keys.</w:t>
+        <w:t xml:space="preserve">Each transfer is a tighter cage with the psychologist closer to the keys.</w:t>
       </w:r>
     </w:p>
     <w:p>
@@ -461,7 +461,7 @@
         <w:spacing w:after="140" w:line="276"/>
       </w:pPr>
       <w:r>
-        <w:t xml:space="preserve">Use this as Silas’s physical journey through the book. Each rung increases isolation, dependency, and Elias’s access — feeding captive/captor, Stockholm, and dubcon in one move:</w:t>
+        <w:t xml:space="preserve">Use this as the inmate’s physical journey through the book. Each rung increases isolation, dependency, and the psychologist’s access — feeding captive/captor, Stockholm, and dubcon in one move:</w:t>
       </w:r>
     </w:p>
     <w:p>
@@ -474,7 +474,7 @@
         <w:spacing w:after="70" w:line="270"/>
       </w:pPr>
       <w:r>
-        <w:t xml:space="preserve">General population. Silas is one inmate among many; Elias has only scheduled sessions. Surveillance, distance, the long game.</w:t>
+        <w:t xml:space="preserve">General population. The inmate is one among many; the psychologist has only scheduled sessions. Surveillance, distance, the long game.</w:t>
       </w:r>
     </w:p>
     <w:p>
@@ -487,7 +487,7 @@
         <w:spacing w:after="70" w:line="270"/>
       </w:pPr>
       <w:r>
-        <w:t xml:space="preserve">Protective segregation / “mental-health observation.” After the yard attack, Elias recommends Silas be moved ‘for his own safety’ and ‘for assessment.’ This is a real, plausible lever — and it isolates Silas while framing the isolation as care.</w:t>
+        <w:t xml:space="preserve">Protective segregation / “mental-health observation.” After the yard attack, the psychologist recommends the inmate be moved ‘for his own safety’ and ‘for assessment.’ This is a real, plausible lever — and it isolates the inmate while framing the isolation as care.</w:t>
       </w:r>
     </w:p>
     <w:p>
@@ -500,7 +500,7 @@
         <w:spacing w:after="70" w:line="270"/>
       </w:pPr>
       <w:r>
-        <w:t xml:space="preserve">The prison’s Mental Health Unit (the ‘forensic wing’). Elias documents a deteriorating mental state and gets Silas moved into the clinical wing, where psych staff — his domain — control meds, lights, observation, and access far more than the COs do. THIS is your ‘forensic unit’: an in-prison clinical wing, not a separate institution.</w:t>
+        <w:t xml:space="preserve">The prison’s Mental Health Unit (the ‘forensic wing’). The psychologist documents a deteriorating mental state and gets the inmate moved into the clinical wing, where psych staff — his domain — control meds, lights, observation, and access far more than the officers do. THIS is your ‘forensic unit’: an in-prison clinical wing, not a separate institution.</w:t>
       </w:r>
     </w:p>
     <w:p>
@@ -513,7 +513,7 @@
         <w:spacing w:after="70" w:line="270"/>
       </w:pPr>
       <w:r>
-        <w:t xml:space="preserve">(Optional, higher stakes) Transfer to a secure forensic psychiatric hospital. If you want to leave the prison walls, Elias builds the ‘criminally insane / unfit’ case the Employer wanted — ironically using it to move Silas somewhere Elias has near-total control. This doubles as the Employer’s objective turning into Elias’s captivity fantasy.</w:t>
+        <w:t xml:space="preserve">(Optional, higher stakes) Transfer to a secure forensic psychiatric hospital. If you want to leave the prison walls, the psychologist builds the ‘criminally insane / unfit’ case the Employer wanted — ironically using it to move the inmate somewhere he has near-total control. This doubles as the Employer’s objective turning into the psychologist’s captivity fantasy.</w:t>
       </w:r>
     </w:p>
     <w:p>
@@ -526,7 +526,7 @@
         <w:spacing w:after="70" w:line="270"/>
       </w:pPr>
       <w:r>
-        <w:t xml:space="preserve">(Endgame) Court-ordered supervised custody. When the conviction is challenged, Silas can be released into a supervised arrangement Elias controls — the cage simply changes shape. Great for a dark ‘captor by choice’ HEA.</w:t>
+        <w:t xml:space="preserve">(Endgame) Court-ordered supervised custody. When the conviction is challenged, the inmate can be released into a supervised arrangement the psychologist controls — the cage simply changes shape. Great for a dark ‘captor by choice’ HEA.</w:t>
       </w:r>
     </w:p>
     <w:p>
@@ -542,7 +542,7 @@
         <w:t xml:space="preserve">Recommendation: </w:t>
       </w:r>
       <w:r>
-        <w:t xml:space="preserve">keep Book 1 inside the prison and make the Mental Health Unit (rung 3) your ‘forensic unit.’ It’s the most claustrophobic, needs the least worldbuilding, and keeps the custody-vs-clinical war — and Hardesty — front and centre. Save the psychiatric-hospital transfer (rung 4) as the cliffhanger or as the spine of a later book in the series.</w:t>
+        <w:t xml:space="preserve">keep Book 1 inside the prison and make the Mental Health Unit (rung 3) your ‘forensic unit.’ It’s the most claustrophobic, needs the least worldbuilding, and keeps the custody-vs-clinical war — and the officer — front and centre. Save the psychiatric-hospital transfer (rung 4) as the cliffhanger or as the spine of a later book in the series.</w:t>
       </w:r>
     </w:p>
     <w:p>
@@ -584,7 +584,7 @@
         <w:spacing w:after="70" w:line="270"/>
       </w:pPr>
       <w:r>
-        <w:t xml:space="preserve">Elias arrives on contract, ulterior motive intact. He controls Silas’s evaluation, meds, segregation, and parole prospects. </w:t>
+        <w:t xml:space="preserve">The psychologist arrives on contract, ulterior motive intact. He controls the inmate’s evaluation, meds, segregation, and parole prospects. </w:t>
       </w:r>
       <w:r>
         <w:rPr>
@@ -605,7 +605,7 @@
         <w:spacing w:after="70" w:line="270"/>
       </w:pPr>
       <w:r>
-        <w:t xml:space="preserve">Silas is hostile — he sees the shrink as one more tool of the system and refuses to perform. Real friction, not banter. </w:t>
+        <w:t xml:space="preserve">The inmate is hostile — he sees the shrink as one more tool of the system and refuses to perform. Real friction, not banter. </w:t>
       </w:r>
       <w:r>
         <w:rPr>
@@ -626,7 +626,7 @@
         <w:spacing w:after="70" w:line="270"/>
       </w:pPr>
       <w:r>
-        <w:t xml:space="preserve">Elias’s ‘due diligence’ becomes obsession: files, surveillance footage, the man’s whole pre-prison history, after-hours camera-watching. The investigation IS the stalking. </w:t>
+        <w:t xml:space="preserve">The psychologist’s ‘due diligence’ becomes obsession: files, surveillance footage, the man’s whole pre-prison history, after-hours camera-watching. The investigation IS the stalking. </w:t>
       </w:r>
       <w:r>
         <w:rPr>
@@ -647,7 +647,7 @@
         <w:spacing w:after="70" w:line="270"/>
       </w:pPr>
       <w:r>
-        <w:t xml:space="preserve">He breaks Silas down in session under the banner of ‘therapeutic confrontation’ — the first taste of contempt-as-control. </w:t>
+        <w:t xml:space="preserve">He breaks the inmate down in session under the banner of ‘therapeutic confrontation’ — the first taste of contempt-as-control. </w:t>
       </w:r>
       <w:r>
         <w:rPr>
@@ -676,7 +676,7 @@
         <w:spacing w:after="70" w:line="270"/>
       </w:pPr>
       <w:r>
-        <w:t xml:space="preserve">The manipulation works too well; Elias is aroused by the control and by Silas’s defiance. He falls — privately, against his own plan. </w:t>
+        <w:t xml:space="preserve">The manipulation works too well; the psychologist is aroused by the control and by the inmate’s defiance. He falls — privately, against his own plan. </w:t>
       </w:r>
       <w:r>
         <w:rPr>
@@ -697,7 +697,7 @@
         <w:spacing w:after="70" w:line="270"/>
       </w:pPr>
       <w:r>
-        <w:t xml:space="preserve">Possession starts to override the contract; he begins protecting Silas in small, deniable ways. </w:t>
+        <w:t xml:space="preserve">Possession starts to override the contract; he begins protecting the inmate in small, deniable ways. </w:t>
       </w:r>
       <w:r>
         <w:rPr>
@@ -747,7 +747,7 @@
         <w:spacing w:after="70" w:line="270"/>
       </w:pPr>
       <w:r>
-        <w:t xml:space="preserve">Another inmate attacks Silas in the yard. Elias’s possessiveness detonates. </w:t>
+        <w:t xml:space="preserve">Another inmate attacks the inmate-lead in the yard. The psychologist’s possessiveness detonates. </w:t>
       </w:r>
       <w:r>
         <w:rPr>
@@ -768,7 +768,7 @@
         <w:spacing w:after="70" w:line="270"/>
       </w:pPr>
       <w:r>
-        <w:t xml:space="preserve">Elias engineers the attacker’s death using what a psychologist plausibly controls — a doctored psych record that gets him moved somewhere fatal, falsified meds, or leverage over a third inmate via confessions from session. </w:t>
+        <w:t xml:space="preserve">The psychologist engineers the attacker’s death using what a psychologist plausibly controls — a doctored psych record that gets him moved somewhere fatal, falsified meds, or leverage over a third inmate via confessions from session. </w:t>
       </w:r>
       <w:r>
         <w:rPr>
@@ -789,7 +789,7 @@
         <w:spacing w:after="70" w:line="270"/>
       </w:pPr>
       <w:r>
-        <w:t xml:space="preserve">The attacker simply vanishes from the wing. Silas begins to understand what Elias is — and is more drawn to him, not less. </w:t>
+        <w:t xml:space="preserve">The attacker simply vanishes from the wing. The inmate begins to understand what the psychologist is — and is more drawn to him, not less. </w:t>
       </w:r>
       <w:r>
         <w:rPr>
@@ -818,7 +818,7 @@
         <w:spacing w:after="70" w:line="270"/>
       </w:pPr>
       <w:r>
-        <w:t xml:space="preserve">Isolated (now in the Mental Health Unit), medicated, and protected only by Elias, Silas attaches — Elias is his sole human contact and the controller of his entire fate. </w:t>
+        <w:t xml:space="preserve">Isolated (now in the Mental Health Unit), medicated, and protected only by the psychologist, the inmate attaches — the psychologist is his sole human contact and the controller of his entire fate. </w:t>
       </w:r>
       <w:r>
         <w:rPr>
@@ -839,7 +839,7 @@
         <w:spacing w:after="70" w:line="270"/>
       </w:pPr>
       <w:r>
-        <w:t xml:space="preserve">The clinical wing tightens the cage: Elias is closer to the keys than any guard. </w:t>
+        <w:t xml:space="preserve">The clinical wing tightens the cage: the psychologist is closer to the keys than any guard. </w:t>
       </w:r>
       <w:r>
         <w:rPr>
@@ -881,7 +881,7 @@
         <w:spacing w:after="70" w:line="270"/>
       </w:pPr>
       <w:r>
-        <w:t xml:space="preserve">CO Hardesty clocks the dynamic, reprimands Elias, and slams Silas into solitary out of spite — custody overriding clinical. Elias takes him out (parking-lot hit-and-run, or a staged overdose / tampered insulin for deniability). Higher risk — an official — which brings the heat that drives Act 4. </w:t>
+        <w:t xml:space="preserve">The officer clocks the dynamic, reprimands the psychologist, and slams the inmate into solitary out of spite — custody overriding clinical. The psychologist takes him out (parking-lot hit-and-run, or a staged overdose / tampered insulin for deniability). Higher risk — an official — which brings the heat that drives Act 4. </w:t>
       </w:r>
       <w:r>
         <w:rPr>
@@ -910,7 +910,7 @@
         <w:spacing w:after="70" w:line="270"/>
       </w:pPr>
       <w:r>
-        <w:t xml:space="preserve">Silas (or an investigator) uncovers the paid-to-destroy contract and the revenge motive. Betrayal: it was all manipulation. Enemies snaps back to enemies. </w:t>
+        <w:t xml:space="preserve">The inmate (or an investigator) uncovers the paid-to-destroy contract and the revenge motive. Betrayal: it was all manipulation. Enemies snaps back to enemies. </w:t>
       </w:r>
       <w:r>
         <w:rPr>
@@ -931,7 +931,7 @@
         <w:spacing w:after="70" w:line="270"/>
       </w:pPr>
       <w:r>
-        <w:t xml:space="preserve">Simultaneously Elias learns the truth: Silas is innocent / justified, and the Employer is the real killer. His revenge was aimed at the wrong man.</w:t>
+        <w:t xml:space="preserve">Simultaneously the psychologist learns the truth: the inmate is innocent / justified, and the Employer is the real killer. His revenge was aimed at the wrong man.</w:t>
       </w:r>
     </w:p>
     <w:p>
@@ -952,7 +952,7 @@
         <w:spacing w:after="70" w:line="270"/>
       </w:pPr>
       <w:r>
-        <w:t xml:space="preserve">Elias chooses Silas over the payout and the revenge. He weaponises his expertise to overturn the conviction — discrediting evidence, exposing the Employer, expert testimony. </w:t>
+        <w:t xml:space="preserve">The psychologist chooses the inmate over the payout and the revenge. He weaponises his expertise to overturn the conviction — discrediting evidence, exposing the Employer, expert testimony. </w:t>
       </w:r>
       <w:r>
         <w:rPr>
@@ -973,7 +973,7 @@
         <w:spacing w:after="70" w:line="270"/>
       </w:pPr>
       <w:r>
-        <w:t xml:space="preserve">Dark HEA: they end up together, both morally bankrupt and bonded by it (Bonnie-and-Clyde energy). Optional capstone: Silas freed into Elias’s supervised custody — the captor dynamic persists by choice. </w:t>
+        <w:t xml:space="preserve">Dark HEA: they end up together, both morally bankrupt and bonded by it (Bonnie-and-Clyde energy). Optional capstone: the inmate freed into the psychologist’s supervised custody — the captor dynamic persists by choice. </w:t>
       </w:r>
       <w:r>
         <w:rPr>
@@ -1138,7 +1138,7 @@
                 <w:bCs w:val="false"/>
                 <w:color w:val="000000"/>
               </w:rPr>
-              <w:t xml:space="preserve">Premise — Elias controls evaluation, meds, segregation, parole (Act 1 onward).</w:t>
+              <w:t xml:space="preserve">Premise — the psychologist controls evaluation, meds, segregation, parole (Act 1 onward).</w:t>
             </w:r>
           </w:p>
         </w:tc>
@@ -1382,7 +1382,7 @@
                 <w:bCs w:val="false"/>
                 <w:color w:val="000000"/>
               </w:rPr>
-              <w:t xml:space="preserve">Elias falls in 2A against his own plan; villain-weighted POV.</w:t>
+              <w:t xml:space="preserve">The psychologist falls in 2A against his own plan; villain-weighted POV.</w:t>
             </w:r>
           </w:p>
         </w:tc>
@@ -1565,7 +1565,7 @@
                 <w:bCs w:val="false"/>
                 <w:color w:val="000000"/>
               </w:rPr>
-              <w:t xml:space="preserve">Act 3 dependency — Elias as sole protector and human contact.</w:t>
+              <w:t xml:space="preserve">Act 3 dependency — the psychologist as sole protector and human contact.</w:t>
             </w:r>
           </w:p>
         </w:tc>
@@ -1626,7 +1626,7 @@
                 <w:bCs w:val="false"/>
                 <w:color w:val="000000"/>
               </w:rPr>
-              <w:t xml:space="preserve">Kill 1 (attacker, Act 2B) + Kill 2 (CO Hardesty, Act 3) — escalation ladder.</w:t>
+              <w:t xml:space="preserve">Kill 1 (attacker, Act 2B) + Kill 2 (the officer, Act 3) — escalation ladder.</w:t>
             </w:r>
           </w:p>
         </w:tc>
@@ -1772,7 +1772,7 @@
         <w:spacing w:after="70" w:line="270"/>
       </w:pPr>
       <w:r>
-        <w:t xml:space="preserve">Make the dubcon legible, not accidental. The most compelling dark-romance dubcon is written so the reader clearly sees the power asymmetry AND the magnetic pull at once. Elias’s clinical justifications are the perfect vehicle — he narrates coercion as ‘treatment,’ which is more unsettling than any villainy stated outright.</w:t>
+        <w:t xml:space="preserve">Make the dubcon legible, not accidental. The most compelling dark-romance dubcon is written so the reader clearly sees the power asymmetry AND the magnetic pull at once. The psychologist’s clinical justifications are the perfect vehicle — he narrates coercion as ‘treatment,’ which is more unsettling than any villainy stated outright.</w:t>
       </w:r>
     </w:p>
     <w:p>
@@ -1785,7 +1785,7 @@
         <w:spacing w:after="70" w:line="270"/>
       </w:pPr>
       <w:r>
-        <w:t xml:space="preserve">Use degradation as character, not decoration. Tie it to Elias’s need for control and Silas’s defiance so it escalates the relationship rather than sitting there as a spice beat. The arc: contempt → control → a perverse tenderness.</w:t>
+        <w:t xml:space="preserve">Use degradation as character, not decoration. Tie it to the psychologist’s need for control and the inmate’s defiance so it escalates the relationship rather than sitting there as a spice beat. The arc: contempt → control → a perverse tenderness.</w:t>
       </w:r>
     </w:p>
     <w:p>
@@ -1798,7 +1798,7 @@
         <w:spacing w:after="70" w:line="270"/>
       </w:pPr>
       <w:r>
-        <w:t xml:space="preserve">Protect the ‘redeemability line.’ Readers will let Elias murder freely — but the one near-universal hard no is an MMC who is irredeemable TO THE LOVE INTEREST with no arc. His cruelty toward Silas must always have the obsession/devotion readable underneath, and the Act-4 reveal (he turns on his Employer FOR Silas) is what buys the villain back.</w:t>
+        <w:t xml:space="preserve">Protect the ‘redeemability line.’ Readers will let the psychologist murder freely — but the one near-universal hard no is an MMC who is irredeemable TO THE LOVE INTEREST with no arc. His cruelty toward the inmate must always have the obsession/devotion readable underneath, and the Act-4 reveal (he turns on his Employer FOR the inmate) is what buys the villain back.</w:t>
       </w:r>
     </w:p>
     <w:p>
@@ -1811,7 +1811,7 @@
         <w:spacing w:after="70" w:line="270"/>
       </w:pPr>
       <w:r>
-        <w:t xml:space="preserve">Earn the Stockholm. Give Silas agency and intelligence so his attachment reads as a survivor adapting to (and eventually turning) his captor — not passivity. The most satisfying version: by the end, Silas is as dangerous as Elias.</w:t>
+        <w:t xml:space="preserve">Earn the Stockholm. Give the inmate agency and intelligence so his attachment reads as a survivor adapting to (and eventually turning) his captor — not passivity. The most satisfying version: by the end, the inmate is as dangerous as the psychologist.</w:t>
       </w:r>
     </w:p>
     <w:p>
@@ -1905,7 +1905,7 @@
         <w:spacing w:after="70" w:line="270"/>
       </w:pPr>
       <w:r>
-        <w:t xml:space="preserve">Elias’s ‘fixer’ skill set — clean kills via clinical access — makes him a cameo-able series antihero others fear or hire.</w:t>
+        <w:t xml:space="preserve">The psychologist’s ‘fixer’ skill set — clean kills via clinical access — makes him a cameo-able series antihero others fear or hire.</w:t>
       </w:r>
     </w:p>
     <w:p>
@@ -1939,7 +1939,7 @@
         <w:spacing w:after="70" w:line="270"/>
       </w:pPr>
       <w:r>
-        <w:t xml:space="preserve">Lock character names, ages, and the exact nature of the ‘person Elias knew’ (this controls the emotional stakes of the twist).</w:t>
+        <w:t xml:space="preserve">Lock ages and the exact nature of the ‘person the psychologist knew’ (this controls the emotional stakes of the twist).</w:t>
       </w:r>
     </w:p>
     <w:p>

</xml_diff>

<commit_message>
Lock story engine to Revenge + Paid contract with kindred-monster layer
Co-Authored-By: Claude Opus 4.8 (1M context) <noreply@anthropic.com>
Claude-Session: https://claude.ai/code/session_01XPJW3cWNtKJW2iRHbtxJrM
</commit_message>
<xml_diff>
--- a/The-Prison-Series-Story-Bible.docx
+++ b/The-Prison-Series-Story-Bible.docx
@@ -129,7 +129,7 @@
         <w:spacing w:after="140" w:line="276"/>
       </w:pPr>
       <w:r>
-        <w:t xml:space="preserve">A forensic psychologist is contracted into a prison to assess and “treat” inmates. He singles one out under the cover of clinical interest, but his real agenda is darker: the inmate is convicted of killing someone the psychologist knew, and a third party is quietly paying him to get inside the inmate’s head and bury him. The manipulation works — until it curdles into arousal, then obsession, then murder. As the psychologist kills to keep his inmate, he uncovers the truth: the man he was sent to destroy is innocent, and his employer is the real monster. He chooses the inmate over the payout and the revenge, and burns everything down to free him.</w:t>
+        <w:t xml:space="preserve">A forensic psychologist is contracted into a prison to assess and “treat” inmates. He singles one out under the cover of clinical interest, but his real agenda is darker: the inmate is convicted of murdering someone the psychologist loved, and a third party is quietly paying him to get inside the inmate’s head and bury him. He comes for revenge — but the inmate, instead of breaking, sees the predator beneath the clinician’s mask and refuses to look away, and the vengeance curdles into arousal, then obsession, then murder. As the psychologist kills to keep his inmate, he uncovers the truth: the man he was sent to destroy is innocent, and his employer is the real monster — the one who actually took the person he loved. He chooses the inmate over the payout and the revenge, and burns everything down to free him.</w:t>
       </w:r>
     </w:p>
     <w:p>
@@ -237,6 +237,19 @@
     </w:p>
     <w:p>
       <w:pPr>
+        <w:pStyle w:val="ListParagraph"/>
+        <w:numPr>
+          <w:ilvl w:val="0"/>
+          <w:numId w:val="2"/>
+        </w:numPr>
+        <w:spacing w:after="70" w:line="270"/>
+      </w:pPr>
+      <w:r>
+        <w:t xml:space="preserve">A hidden, never-caught predator beneath the respectable mask — his whole life is the performance of normalcy. The inmate is the first person ever to see through it (the kindred-monster spark).</w:t>
+      </w:r>
+    </w:p>
+    <w:p>
+      <w:pPr>
         <w:pStyle w:val="Heading3"/>
       </w:pPr>
       <w:r>
@@ -266,7 +279,20 @@
         <w:spacing w:after="70" w:line="270"/>
       </w:pPr>
       <w:r>
-        <w:t xml:space="preserve">Innocent, or justified (see the twist). His resistance, then dependence, then attachment is the spine of the Stockholm arc.</w:t>
+        <w:t xml:space="preserve">Innocent of THIS murder — but no lamb. A dangerous man who has gotten away with other things, which is why the frame held and why he can match the psychologist blow for blow.</w:t>
+      </w:r>
+    </w:p>
+    <w:p>
+      <w:pPr>
+        <w:pStyle w:val="ListParagraph"/>
+        <w:numPr>
+          <w:ilvl w:val="0"/>
+          <w:numId w:val="2"/>
+        </w:numPr>
+        <w:spacing w:after="70" w:line="270"/>
+      </w:pPr>
+      <w:r>
+        <w:t xml:space="preserve">He recognises the predator under the clinician’s mask and refuses to look away. His resistance, then circling, then attachment is the spine of the arc.</w:t>
       </w:r>
     </w:p>
     <w:p>
@@ -321,7 +347,7 @@
         <w:pStyle w:val="Heading1"/>
       </w:pPr>
       <w:r>
-        <w:t xml:space="preserve">3. The Central Engine (the thing that makes it cohere)</w:t>
+        <w:t xml:space="preserve">3. The Central Engine (LOCKED: Revenge + Paid Contract, with a kindred-monster heart)</w:t>
       </w:r>
     </w:p>
     <w:p>
@@ -329,7 +355,7 @@
         <w:spacing w:after="140" w:line="276"/>
       </w:pPr>
       <w:r>
-        <w:t xml:space="preserve">Do not choose between your two ulterior-motive ideas — stack them. Together they generate the twist that powers the entire book.</w:t>
+        <w:t xml:space="preserve">Two motives stacked into one man, plus a character layer that makes the romance sing. This is the spine everything else hangs from.</w:t>
       </w:r>
     </w:p>
     <w:p>
@@ -342,10 +368,10 @@
           <w:bCs/>
           <w:color w:val="7B1E22"/>
         </w:rPr>
-        <w:t xml:space="preserve">The setup: </w:t>
-      </w:r>
-      <w:r>
-        <w:t xml:space="preserve">The psychologist takes the prison contract because the Employer is paying him to get inside the inmate’s head — to extract something (a name, a location, evidence) or to build the case that the inmate is criminally insane so he disappears into a secure facility forever. The personal hook: the inmate is convicted of killing someone the psychologist knew. The psychologist tells himself this is revenge.</w:t>
+        <w:t xml:space="preserve">The setup — revenge: </w:t>
+      </w:r>
+      <w:r>
+        <w:t xml:space="preserve">Someone the psychologist loved (a brother, a partner, or his closest friend — your call) was murdered. The inmate was convicted of it. The psychologist engineers his way into the prison contract to get close to the man who took his person — and to slowly, clinically destroy him. Psychological torture as vengeance.</w:t>
       </w:r>
     </w:p>
     <w:p>
@@ -358,10 +384,58 @@
           <w:bCs/>
           <w:color w:val="7B1E22"/>
         </w:rPr>
+        <w:t xml:space="preserve">The setup — the paycheck: </w:t>
+      </w:r>
+      <w:r>
+        <w:t xml:space="preserve">He is also being quietly paid by the Employer to make sure the inmate is broken, discredited, or declared criminally insane so he stays buried. The money is perfect cover: it funds and explains his presence, and lets him tell himself this is a job, not a vendetta.</w:t>
+      </w:r>
+    </w:p>
+    <w:p>
+      <w:pPr>
+        <w:spacing w:after="120" w:line="276"/>
+      </w:pPr>
+      <w:r>
+        <w:rPr>
+          <w:b/>
+          <w:bCs/>
+          <w:color w:val="7B1E22"/>
+        </w:rPr>
+        <w:t xml:space="preserve">The relationship heart — two monsters: </w:t>
+      </w:r>
+      <w:r>
+        <w:t xml:space="preserve">His revenge campaign reveals what he has hidden his whole life: the cruelty comes naturally. He is a predator wearing a clinician’s mask. And the inmate, instead of breaking, sees him — recognises a fellow monster and refuses to look away. The vengeance curdles into obsession because the inmate is the first person ever to truly see him and match him. This is your kindred-monster heart, and it is what makes the pairing addictive.</w:t>
+      </w:r>
+    </w:p>
+    <w:p>
+      <w:pPr>
+        <w:spacing w:after="120" w:line="276"/>
+      </w:pPr>
+      <w:r>
+        <w:rPr>
+          <w:b/>
+          <w:bCs/>
+          <w:color w:val="7B1E22"/>
+        </w:rPr>
         <w:t xml:space="preserve">The twist (Act 4): </w:t>
       </w:r>
       <w:r>
-        <w:t xml:space="preserve">The inmate is innocent — or the killing was justified — and the Employer is the real killer (or the dead man’s crime family covering it up). Now the psychologist’s two motives collide: the revenge was aimed at the wrong man, and the people paying him are the ones who deserve it.</w:t>
+        <w:t xml:space="preserve">The inmate didn’t do it. The Employer — the very man paying the psychologist to bury him — is the real killer of the person the psychologist loved, and framed the inmate for it. The psychologist has spent the whole book torturing an innocent man on behalf of the murderer he has been hunting without knowing it.</w:t>
+      </w:r>
+    </w:p>
+    <w:p>
+      <w:pPr>
+        <w:spacing w:after="120" w:line="276"/>
+      </w:pPr>
+      <w:r>
+        <w:rPr>
+          <w:b/>
+          <w:bCs/>
+          <w:color w:val="7B1E22"/>
+        </w:rPr>
+        <w:t xml:space="preserve">The nuance that keeps him dangerous: </w:t>
+      </w:r>
+      <w:r>
+        <w:t xml:space="preserve">Keep the inmate innocent of THIS crime but not a lamb — a man who has done other dark things and gotten away with them. That is why the frame was believable, why he can match the psychologist, and why the ending is two monsters together rather than monster-and-victim.</w:t>
       </w:r>
     </w:p>
     <w:p>
@@ -373,7 +447,7 @@
           <w:i/>
           <w:iCs/>
         </w:rPr>
-        <w:t xml:space="preserve">That single collision gives you, for free: the enemies-to-lovers beef, the betrayal black moment, the “overturn the conviction” climax, and the series tie-in.</w:t>
+        <w:t xml:space="preserve">This single collision gives you: the enemies-to-lovers beef, the kindred-monster chemistry, the betrayal black moment, the “overturn the conviction” climax, and the Employer as your ready-made series villain.</w:t>
       </w:r>
     </w:p>
     <w:p>
@@ -685,6 +759,27 @@
           <w:color w:val="7B1E22"/>
         </w:rPr>
         <w:t xml:space="preserve">[He Falls First / Villain]</w:t>
+      </w:r>
+    </w:p>
+    <w:p>
+      <w:pPr>
+        <w:pStyle w:val="ListParagraph"/>
+        <w:numPr>
+          <w:ilvl w:val="0"/>
+          <w:numId w:val="2"/>
+        </w:numPr>
+        <w:spacing w:after="70" w:line="270"/>
+      </w:pPr>
+      <w:r>
+        <w:t xml:space="preserve">THE RECOGNITION (mid-book detonation): the inmate names what the psychologist is out loud — sees the predator under the mask. Intoxicating AND a mortal threat, because the inmate could expose him. Delay this card to here, not chapter one. </w:t>
+      </w:r>
+      <w:r>
+        <w:rPr>
+          <w:b/>
+          <w:bCs/>
+          <w:color w:val="7B1E22"/>
+        </w:rPr>
+        <w:t xml:space="preserve">[Kindred Monster]</w:t>
       </w:r>
     </w:p>
     <w:p>
@@ -1415,6 +1510,67 @@
                 <w:bCs w:val="false"/>
                 <w:color w:val="000000"/>
               </w:rPr>
+              <w:t xml:space="preserve">Kindred Monster / two killers</w:t>
+            </w:r>
+          </w:p>
+        </w:tc>
+        <w:tc>
+          <w:tcPr>
+            <w:tcW w:type="dxa" w:w="6160"/>
+            <w:tcBorders>
+              <w:top w:val="single" w:color="C9B8B9" w:sz="1"/>
+              <w:left w:val="single" w:color="C9B8B9" w:sz="1"/>
+              <w:bottom w:val="single" w:color="C9B8B9" w:sz="1"/>
+              <w:right w:val="single" w:color="C9B8B9" w:sz="1"/>
+            </w:tcBorders>
+            <w:shd w:fill="FFFFFF" w:val="clear"/>
+            <w:tcMar>
+              <w:top w:type="dxa" w:w="70"/>
+              <w:left w:type="dxa" w:w="110"/>
+              <w:bottom w:type="dxa" w:w="70"/>
+              <w:right w:type="dxa" w:w="110"/>
+            </w:tcMar>
+          </w:tcPr>
+          <w:p>
+            <w:r>
+              <w:rPr>
+                <w:b w:val="false"/>
+                <w:bCs w:val="false"/>
+                <w:color w:val="000000"/>
+              </w:rPr>
+              <w:t xml:space="preserve">Both leads are lethal; the mid-book recognition (Act 2A) detonates the dynamic and powers the 'bad together' HEA.</w:t>
+            </w:r>
+          </w:p>
+        </w:tc>
+      </w:tr>
+      <w:tr>
+        <w:trPr>
+          <w:tblHeader w:val="false"/>
+        </w:trPr>
+        <w:tc>
+          <w:tcPr>
+            <w:tcW w:type="dxa" w:w="2600"/>
+            <w:tcBorders>
+              <w:top w:val="single" w:color="C9B8B9" w:sz="1"/>
+              <w:left w:val="single" w:color="C9B8B9" w:sz="1"/>
+              <w:bottom w:val="single" w:color="C9B8B9" w:sz="1"/>
+              <w:right w:val="single" w:color="C9B8B9" w:sz="1"/>
+            </w:tcBorders>
+            <w:shd w:fill="EFE6E7" w:val="clear"/>
+            <w:tcMar>
+              <w:top w:type="dxa" w:w="70"/>
+              <w:left w:type="dxa" w:w="110"/>
+              <w:bottom w:type="dxa" w:w="70"/>
+              <w:right w:type="dxa" w:w="110"/>
+            </w:tcMar>
+          </w:tcPr>
+          <w:p>
+            <w:r>
+              <w:rPr>
+                <w:b w:val="false"/>
+                <w:bCs w:val="false"/>
+                <w:color w:val="000000"/>
+              </w:rPr>
               <w:t xml:space="preserve">Captive / Captor</w:t>
             </w:r>
           </w:p>
@@ -1428,7 +1584,7 @@
               <w:bottom w:val="single" w:color="C9B8B9" w:sz="1"/>
               <w:right w:val="single" w:color="C9B8B9" w:sz="1"/>
             </w:tcBorders>
-            <w:shd w:fill="FFFFFF" w:val="clear"/>
+            <w:shd w:fill="EFE6E7" w:val="clear"/>
             <w:tcMar>
               <w:top w:type="dxa" w:w="70"/>
               <w:left w:type="dxa" w:w="110"/>
@@ -1461,7 +1617,7 @@
               <w:bottom w:val="single" w:color="C9B8B9" w:sz="1"/>
               <w:right w:val="single" w:color="C9B8B9" w:sz="1"/>
             </w:tcBorders>
-            <w:shd w:fill="EFE6E7" w:val="clear"/>
+            <w:shd w:fill="FFFFFF" w:val="clear"/>
             <w:tcMar>
               <w:top w:type="dxa" w:w="70"/>
               <w:left w:type="dxa" w:w="110"/>
@@ -1489,7 +1645,7 @@
               <w:bottom w:val="single" w:color="C9B8B9" w:sz="1"/>
               <w:right w:val="single" w:color="C9B8B9" w:sz="1"/>
             </w:tcBorders>
-            <w:shd w:fill="EFE6E7" w:val="clear"/>
+            <w:shd w:fill="FFFFFF" w:val="clear"/>
             <w:tcMar>
               <w:top w:type="dxa" w:w="70"/>
               <w:left w:type="dxa" w:w="110"/>
@@ -1522,7 +1678,7 @@
               <w:bottom w:val="single" w:color="C9B8B9" w:sz="1"/>
               <w:right w:val="single" w:color="C9B8B9" w:sz="1"/>
             </w:tcBorders>
-            <w:shd w:fill="FFFFFF" w:val="clear"/>
+            <w:shd w:fill="EFE6E7" w:val="clear"/>
             <w:tcMar>
               <w:top w:type="dxa" w:w="70"/>
               <w:left w:type="dxa" w:w="110"/>
@@ -1550,7 +1706,7 @@
               <w:bottom w:val="single" w:color="C9B8B9" w:sz="1"/>
               <w:right w:val="single" w:color="C9B8B9" w:sz="1"/>
             </w:tcBorders>
-            <w:shd w:fill="FFFFFF" w:val="clear"/>
+            <w:shd w:fill="EFE6E7" w:val="clear"/>
             <w:tcMar>
               <w:top w:type="dxa" w:w="70"/>
               <w:left w:type="dxa" w:w="110"/>
@@ -1583,7 +1739,7 @@
               <w:bottom w:val="single" w:color="C9B8B9" w:sz="1"/>
               <w:right w:val="single" w:color="C9B8B9" w:sz="1"/>
             </w:tcBorders>
-            <w:shd w:fill="EFE6E7" w:val="clear"/>
+            <w:shd w:fill="FFFFFF" w:val="clear"/>
             <w:tcMar>
               <w:top w:type="dxa" w:w="70"/>
               <w:left w:type="dxa" w:w="110"/>
@@ -1611,7 +1767,7 @@
               <w:bottom w:val="single" w:color="C9B8B9" w:sz="1"/>
               <w:right w:val="single" w:color="C9B8B9" w:sz="1"/>
             </w:tcBorders>
-            <w:shd w:fill="EFE6E7" w:val="clear"/>
+            <w:shd w:fill="FFFFFF" w:val="clear"/>
             <w:tcMar>
               <w:top w:type="dxa" w:w="70"/>
               <w:left w:type="dxa" w:w="110"/>
@@ -1644,7 +1800,7 @@
               <w:bottom w:val="single" w:color="C9B8B9" w:sz="1"/>
               <w:right w:val="single" w:color="C9B8B9" w:sz="1"/>
             </w:tcBorders>
-            <w:shd w:fill="FFFFFF" w:val="clear"/>
+            <w:shd w:fill="EFE6E7" w:val="clear"/>
             <w:tcMar>
               <w:top w:type="dxa" w:w="70"/>
               <w:left w:type="dxa" w:w="110"/>
@@ -1672,7 +1828,7 @@
               <w:bottom w:val="single" w:color="C9B8B9" w:sz="1"/>
               <w:right w:val="single" w:color="C9B8B9" w:sz="1"/>
             </w:tcBorders>
-            <w:shd w:fill="FFFFFF" w:val="clear"/>
+            <w:shd w:fill="EFE6E7" w:val="clear"/>
             <w:tcMar>
               <w:top w:type="dxa" w:w="70"/>
               <w:left w:type="dxa" w:w="110"/>
@@ -1705,7 +1861,7 @@
               <w:bottom w:val="single" w:color="C9B8B9" w:sz="1"/>
               <w:right w:val="single" w:color="C9B8B9" w:sz="1"/>
             </w:tcBorders>
-            <w:shd w:fill="EFE6E7" w:val="clear"/>
+            <w:shd w:fill="FFFFFF" w:val="clear"/>
             <w:tcMar>
               <w:top w:type="dxa" w:w="70"/>
               <w:left w:type="dxa" w:w="110"/>
@@ -1733,7 +1889,7 @@
               <w:bottom w:val="single" w:color="C9B8B9" w:sz="1"/>
               <w:right w:val="single" w:color="C9B8B9" w:sz="1"/>
             </w:tcBorders>
-            <w:shd w:fill="EFE6E7" w:val="clear"/>
+            <w:shd w:fill="FFFFFF" w:val="clear"/>
             <w:tcMar>
               <w:top w:type="dxa" w:w="70"/>
               <w:left w:type="dxa" w:w="110"/>
@@ -1812,6 +1968,19 @@
       </w:pPr>
       <w:r>
         <w:t xml:space="preserve">Earn the Stockholm. Give the inmate agency and intelligence so his attachment reads as a survivor adapting to (and eventually turning) his captor — not passivity. The most satisfying version: by the end, the inmate is as dangerous as the psychologist.</w:t>
+      </w:r>
+    </w:p>
+    <w:p>
+      <w:pPr>
+        <w:pStyle w:val="ListParagraph"/>
+        <w:numPr>
+          <w:ilvl w:val="0"/>
+          <w:numId w:val="3"/>
+        </w:numPr>
+        <w:spacing w:after="70" w:line="270"/>
+      </w:pPr>
+      <w:r>
+        <w:t xml:space="preserve">Delay the recognition. The kindred-monster reveal is your best card — let the psychologist deny it (‘I am only clinically interested’) while the inmate needles and tests him, the mask cracking session by session. Spend it mid-book, never in chapter one. Two monsters who clock each other on page one have nowhere left to go.</w:t>
       </w:r>
     </w:p>
     <w:p>

</xml_diff>

<commit_message>
Rewrite story bible around the Copycat engine: midpoint reveal + killing-pair ending
Co-Authored-By: Claude Opus 4.8 (1M context) <noreply@anthropic.com>
Claude-Session: https://claude.ai/code/session_01XPJW3cWNtKJW2iRHbtxJrM
</commit_message>
<xml_diff>
--- a/The-Prison-Series-Story-Bible.docx
+++ b/The-Prison-Series-Story-Bible.docx
@@ -129,7 +129,7 @@
         <w:spacing w:after="140" w:line="276"/>
       </w:pPr>
       <w:r>
-        <w:t xml:space="preserve">A forensic psychologist is contracted into a prison to assess and “treat” inmates. He singles one out under the cover of clinical interest, but his real agenda is darker: the inmate is convicted of murdering someone the psychologist loved, and a third party is quietly paying him to get inside the inmate’s head and bury him. He comes for revenge — but the inmate, instead of breaking, sees the predator beneath the clinician’s mask and refuses to look away, and the vengeance curdles into arousal, then obsession, then murder. As the psychologist kills to keep his inmate, he uncovers the truth: the man he was sent to destroy is innocent, and his employer is the real monster — the one who actually took the person he loved. He chooses the inmate over the payout and the revenge, and burns everything down to free him.</w:t>
+        <w:t xml:space="preserve">A forensic psychologist takes a prison contract to assess and “treat” inmates and singles one out under cover of clinical interest. The inmate is a convicted serial killer — and the psychologist is fascinated, because the inmate’s work is exquisite and the man is the only mind that could ever match his own. What the reader does not learn until the midpoint is the psychologist’s secret: HE is a killer too, and his own sloppy murder — committed in the inmate’s style — is the copycat kill that handed police the pattern and put the inmate in this cage. He came partly out of obsession, partly to control the one man who could expose him. As clinical manipulation curdles into arousal, possession, and murder, the dread becomes when the inmate will find out — and when he does, the betrayal binds them instead of breaking them. The psychologist gets him out, and they vanish together: a killing pair.</w:t>
       </w:r>
     </w:p>
     <w:p>
@@ -145,7 +145,7 @@
         <w:t xml:space="preserve">Genre: </w:t>
       </w:r>
       <w:r>
-        <w:t xml:space="preserve">Dark MM romance — morally black antihero, enemies-to-lovers, captive/captor. Standalone romance with a guaranteed HEA/HFN, set in a recurring world.</w:t>
+        <w:t xml:space="preserve">Dark MM romance — morally black antihero, enemies-to-lovers, captive/captor, two-killers. Standalone romance with a guaranteed HEA/HFN, set in a recurring world.</w:t>
       </w:r>
     </w:p>
     <w:p>
@@ -161,7 +161,7 @@
         <w:t xml:space="preserve">POV: </w:t>
       </w:r>
       <w:r>
-        <w:t xml:space="preserve">Dual POV, weighted toward the psychologist (the villain), so “he falls first” lands and the reader is seduced into rooting for the bad guy.</w:t>
+        <w:t xml:space="preserve">Dual POV, weighted toward the psychologist (the villain), so “he falls first” lands and the reader is seduced into rooting for the bad guy. His POV is compartmentalised — he withholds his own secret from himself, which lets us withhold it from the reader until the midpoint.</w:t>
       </w:r>
     </w:p>
     <w:p>
@@ -177,7 +177,7 @@
         <w:t xml:space="preserve">Tone: </w:t>
       </w:r>
       <w:r>
-        <w:t xml:space="preserve">Claustrophobic, clinical, predatory. The horror is that the safest-sounding man in the building — the one with the clipboard — is the most dangerous.</w:t>
+        <w:t xml:space="preserve">Claustrophobic, clinical, predatory. The horror is that the safest-sounding man in the building — the one with the clipboard — is the most dangerous, and the one who put his ‘patient’ here.</w:t>
       </w:r>
     </w:p>
     <w:p>
@@ -245,7 +245,20 @@
         <w:spacing w:after="70" w:line="270"/>
       </w:pPr>
       <w:r>
-        <w:t xml:space="preserve">A hidden, never-caught predator beneath the respectable mask — his whole life is the performance of normalcy. The inmate is the first person ever to see through it (the kindred-monster spark).</w:t>
+        <w:t xml:space="preserve">A killer himself — never caught, but messier and more impulsive than he will admit. His whole life is the performance of normalcy.</w:t>
+      </w:r>
+    </w:p>
+    <w:p>
+      <w:pPr>
+        <w:pStyle w:val="ListParagraph"/>
+        <w:numPr>
+          <w:ilvl w:val="0"/>
+          <w:numId w:val="2"/>
+        </w:numPr>
+        <w:spacing w:after="70" w:line="270"/>
+      </w:pPr>
+      <w:r>
+        <w:t xml:space="preserve">THE SECRET (held from the reader until the midpoint): his own copycat kill, done in the inmate’s style, is what gave police the pattern that caught the inmate. He is the reason the man is in a cage. He came to study him, to possess him, and to make sure he never figures it out.</w:t>
       </w:r>
     </w:p>
     <w:p>
@@ -266,33 +279,33 @@
         <w:spacing w:after="70" w:line="270"/>
       </w:pPr>
       <w:r>
-        <w:t xml:space="preserve">Late 20s. Convicted of murder. Defiant, sharp, refuses to perform for the system — which is exactly what hooks the psychologist.</w:t>
-      </w:r>
-    </w:p>
-    <w:p>
-      <w:pPr>
-        <w:pStyle w:val="ListParagraph"/>
-        <w:numPr>
-          <w:ilvl w:val="0"/>
-          <w:numId w:val="2"/>
-        </w:numPr>
-        <w:spacing w:after="70" w:line="270"/>
-      </w:pPr>
-      <w:r>
-        <w:t xml:space="preserve">Innocent of THIS murder — but no lamb. A dangerous man who has gotten away with other things, which is why the frame held and why he can match the psychologist blow for blow.</w:t>
-      </w:r>
-    </w:p>
-    <w:p>
-      <w:pPr>
-        <w:pStyle w:val="ListParagraph"/>
-        <w:numPr>
-          <w:ilvl w:val="0"/>
-          <w:numId w:val="2"/>
-        </w:numPr>
-        <w:spacing w:after="70" w:line="270"/>
-      </w:pPr>
-      <w:r>
-        <w:t xml:space="preserve">He recognises the predator under the clinician’s mask and refuses to look away. His resistance, then circling, then attachment is the spine of the arc.</w:t>
+        <w:t xml:space="preserve">Late 20s. A genuine serial killer — solo, meticulous, an artist of his craft who by his own standards was never going to be caught. Defiant, sharp, refuses to perform for the system.</w:t>
+      </w:r>
+    </w:p>
+    <w:p>
+      <w:pPr>
+        <w:pStyle w:val="ListParagraph"/>
+        <w:numPr>
+          <w:ilvl w:val="0"/>
+          <w:numId w:val="2"/>
+        </w:numPr>
+        <w:spacing w:after="70" w:line="270"/>
+      </w:pPr>
+      <w:r>
+        <w:t xml:space="preserve">Convicted of a cluster of murders that includes sloppy kills the case blames on a supposed ‘partner.’ He is incensed: those clumsy murders are an insult, and they are not his work.</w:t>
+      </w:r>
+    </w:p>
+    <w:p>
+      <w:pPr>
+        <w:pStyle w:val="ListParagraph"/>
+        <w:numPr>
+          <w:ilvl w:val="0"/>
+          <w:numId w:val="2"/>
+        </w:numPr>
+        <w:spacing w:after="70" w:line="270"/>
+      </w:pPr>
+      <w:r>
+        <w:t xml:space="preserve">The only mind that could ever match the psychologist’s. He recognises a fellow monster — the kindred-monster spark — long before he learns what the psychologist did to him.</w:t>
       </w:r>
     </w:p>
     <w:p>
@@ -313,7 +326,7 @@
         <w:spacing w:after="70" w:line="270"/>
       </w:pPr>
       <w:r>
-        <w:t xml:space="preserve">The Employer — the off-page power paying the psychologist; the real villain and the bridge to the wider series.</w:t>
+        <w:t xml:space="preserve">The Detective — methodical, closing in on the still-active copycat. The series nemesis and the second-half pressure: every fresh kill draws them nearer to the psychologist.</w:t>
       </w:r>
     </w:p>
     <w:p>
@@ -347,7 +360,7 @@
         <w:pStyle w:val="Heading1"/>
       </w:pPr>
       <w:r>
-        <w:t xml:space="preserve">3. The Central Engine (LOCKED: Revenge + Paid Contract, with a kindred-monster heart)</w:t>
+        <w:t xml:space="preserve">3. The Central Engine (LOCKED: The Copycat)</w:t>
       </w:r>
     </w:p>
     <w:p>
@@ -355,7 +368,7 @@
         <w:spacing w:after="140" w:line="276"/>
       </w:pPr>
       <w:r>
-        <w:t xml:space="preserve">Two motives stacked into one man, plus a character layer that makes the romance sing. This is the spine everything else hangs from.</w:t>
+        <w:t xml:space="preserve">One man’s secret powers the entire book — and the reader doesn’t get it until the halfway mark. First half: a twisted clinical cat-and-mouse between two killers. Midpoint: the gut-punch. Second half: dread.</w:t>
       </w:r>
     </w:p>
     <w:p>
@@ -368,10 +381,10 @@
           <w:bCs/>
           <w:color w:val="7B1E22"/>
         </w:rPr>
-        <w:t xml:space="preserve">The setup — revenge: </w:t>
-      </w:r>
-      <w:r>
-        <w:t xml:space="preserve">Someone the psychologist loved (a brother, a partner, or his closest friend — your call) was murdered. The inmate was convicted of it. The psychologist engineers his way into the prison contract to get close to the man who took his person — and to slowly, clinically destroy him. Psychological torture as vengeance.</w:t>
+        <w:t xml:space="preserve">The inmate, the truth of him: </w:t>
+      </w:r>
+      <w:r>
+        <w:t xml:space="preserve">A genuine serial killer — solo, meticulous, an artist who by his own standards was never going to be caught. He is no patsy and no lamb; he is the real thing, which is exactly why he can be the psychologist’s equal.</w:t>
       </w:r>
     </w:p>
     <w:p>
@@ -384,10 +397,10 @@
           <w:bCs/>
           <w:color w:val="7B1E22"/>
         </w:rPr>
-        <w:t xml:space="preserve">The setup — the paycheck: </w:t>
-      </w:r>
-      <w:r>
-        <w:t xml:space="preserve">He is also being quietly paid by the Employer to make sure the inmate is broken, discredited, or declared criminally insane so he stays buried. The money is perfect cover: it funds and explains his presence, and lets him tell himself this is a job, not a vendetta.</w:t>
+        <w:t xml:space="preserve">The flaw in his conviction: </w:t>
+      </w:r>
+      <w:r>
+        <w:t xml:space="preserve">He has been convicted of a cluster of murders that includes sloppy kills the prosecution pins on a supposed ‘partner’ (the terms in play: team killers / a killing dyad; the accomplice is a co-offender). The inmate is incensed — those clumsy murders are an insult to his craft, and they are not his.</w:t>
       </w:r>
     </w:p>
     <w:p>
@@ -400,10 +413,10 @@
           <w:bCs/>
           <w:color w:val="7B1E22"/>
         </w:rPr>
-        <w:t xml:space="preserve">The relationship heart — two monsters: </w:t>
-      </w:r>
-      <w:r>
-        <w:t xml:space="preserve">His revenge campaign reveals what he has hidden his whole life: the cruelty comes naturally. He is a predator wearing a clinician’s mask. And the inmate, instead of breaking, sees him — recognises a fellow monster and refuses to look away. The vengeance curdles into obsession because the inmate is the first person ever to truly see him and match him. This is your kindred-monster heart, and it is what makes the pairing addictive.</w:t>
+        <w:t xml:space="preserve">The hidden truth (revealed to the reader at the MIDPOINT): </w:t>
+      </w:r>
+      <w:r>
+        <w:t xml:space="preserve">The psychologist did them. He is a killer too, messier than he admits, working in the inmate’s style — and his sloppy copycat kill, wearing the inmate’s signature, is what handed police the pattern that finally caught the inmate. The man is caged because of the psychologist’s mess. He came to study the artistry he stole, to possess the only mind that matches his, and to control the one person who could expose him.</w:t>
       </w:r>
     </w:p>
     <w:p>
@@ -416,10 +429,10 @@
           <w:bCs/>
           <w:color w:val="7B1E22"/>
         </w:rPr>
-        <w:t xml:space="preserve">The twist (Act 4): </w:t>
-      </w:r>
-      <w:r>
-        <w:t xml:space="preserve">The inmate didn’t do it. The Employer — the very man paying the psychologist to bury him — is the real killer of the person the psychologist loved, and framed the inmate for it. The psychologist has spent the whole book torturing an innocent man on behalf of the murderer he has been hunting without knowing it.</w:t>
+        <w:t xml:space="preserve">The scene the whole book is built around: </w:t>
+      </w:r>
+      <w:r>
+        <w:t xml:space="preserve">The psychologist slides crime-scene photos of his OWN kills across the table. The inmate, not knowing they are the psychologist’s, coldly dissects them — devastated that his name is on such trash, contemptuous of the amateur who did them — while the psychologist sits there undone: aroused at being seen, judged, and matched by the only person alive who could.</w:t>
       </w:r>
     </w:p>
     <w:p>
@@ -432,10 +445,42 @@
           <w:bCs/>
           <w:color w:val="7B1E22"/>
         </w:rPr>
-        <w:t xml:space="preserve">The nuance that keeps him dangerous: </w:t>
-      </w:r>
-      <w:r>
-        <w:t xml:space="preserve">Keep the inmate innocent of THIS crime but not a lamb — a man who has done other dark things and gotten away with them. That is why the frame was believable, why he can match the psychologist, and why the ending is two monsters together rather than monster-and-victim.</w:t>
+        <w:t xml:space="preserve">The midpoint gut-punch &amp; the dread: </w:t>
+      </w:r>
+      <w:r>
+        <w:t xml:space="preserve">The reader learns the truth at the halfway mark, and every prior scene recolours. The back half becomes one question — when will the inmate find out — and what the psychologist will do to stop it.</w:t>
+      </w:r>
+    </w:p>
+    <w:p>
+      <w:pPr>
+        <w:spacing w:after="120" w:line="276"/>
+      </w:pPr>
+      <w:r>
+        <w:rPr>
+          <w:b/>
+          <w:bCs/>
+          <w:color w:val="7B1E22"/>
+        </w:rPr>
+        <w:t xml:space="preserve">The black moment (Act 4): </w:t>
+      </w:r>
+      <w:r>
+        <w:t xml:space="preserve">The inmate finds out: the man feeding, protecting, and obsessing over him is the reason he is in a cage. Rage, betrayal — and then, because they are the same animal, the betrayal curdles into the deepest intimacy either has known. He is the only one who ever truly saw me.</w:t>
+      </w:r>
+    </w:p>
+    <w:p>
+      <w:pPr>
+        <w:spacing w:after="120" w:line="276"/>
+      </w:pPr>
+      <w:r>
+        <w:rPr>
+          <w:b/>
+          <w:bCs/>
+          <w:color w:val="7B1E22"/>
+        </w:rPr>
+        <w:t xml:space="preserve">The ending (Act 5): </w:t>
+      </w:r>
+      <w:r>
+        <w:t xml:space="preserve">A killing pair. With a detective closing in and the state moving the inmate, the psychologist gets him out and they vanish together — folie à deux, two monsters loose. The darkest, most ‘bad together’ HEA there is.</w:t>
       </w:r>
     </w:p>
     <w:p>
@@ -447,7 +492,7 @@
           <w:i/>
           <w:iCs/>
         </w:rPr>
-        <w:t xml:space="preserve">This single collision gives you: the enemies-to-lovers beef, the kindred-monster chemistry, the betrayal black moment, the “overturn the conviction” climax, and the Employer as your ready-made series villain.</w:t>
+        <w:t xml:space="preserve">This single secret gives you: enemies-to-lovers, kindred-monster chemistry, the midpoint sucker-punch, a built-in betrayal black moment, and a detective / manhunt to power the series.</w:t>
       </w:r>
     </w:p>
     <w:p>
@@ -587,7 +632,7 @@
         <w:spacing w:after="70" w:line="270"/>
       </w:pPr>
       <w:r>
-        <w:t xml:space="preserve">(Optional, higher stakes) Transfer to a secure forensic psychiatric hospital. If you want to leave the prison walls, the psychologist builds the ‘criminally insane / unfit’ case the Employer wanted — ironically using it to move the inmate somewhere he has near-total control. This doubles as the Employer’s objective turning into the psychologist’s captivity fantasy.</w:t>
+        <w:t xml:space="preserve">(Higher stakes) Pending transfer to a secure forensic psychiatric hospital. The psychologist builds the ‘criminally insane / unfit’ case to move the inmate somewhere he has near-total control — and, crucially, the transfer puts the inmate on the road, outside the walls, under far lighter guard.</w:t>
       </w:r>
     </w:p>
     <w:p>
@@ -600,7 +645,7 @@
         <w:spacing w:after="70" w:line="270"/>
       </w:pPr>
       <w:r>
-        <w:t xml:space="preserve">(Endgame) Court-ordered supervised custody. When the conviction is challenged, the inmate can be released into a supervised arrangement the psychologist controls — the cage simply changes shape. Great for a dark ‘captor by choice’ HEA.</w:t>
+        <w:t xml:space="preserve">(Endgame) The transfer becomes the break-out. With the detective closing in and the move scheduled, the psychologist engineers the inmate’s escape in transit. The cage doesn’t change shape — it opens, and they run together. This is your killing-pair HEA.</w:t>
       </w:r>
     </w:p>
     <w:p>
@@ -616,7 +661,7 @@
         <w:t xml:space="preserve">Recommendation: </w:t>
       </w:r>
       <w:r>
-        <w:t xml:space="preserve">keep Book 1 inside the prison and make the Mental Health Unit (rung 3) your ‘forensic unit.’ It’s the most claustrophobic, needs the least worldbuilding, and keeps the custody-vs-clinical war — and the officer — front and centre. Save the psychiatric-hospital transfer (rung 4) as the cliffhanger or as the spine of a later book in the series.</w:t>
+        <w:t xml:space="preserve">keep Book 1 inside the prison and make the Mental Health Unit (rung 3) your ‘forensic unit.’ It’s the most claustrophobic, needs the least worldbuilding, and keeps the custody-vs-clinical war — and the officer — front and centre. Then use the psychiatric-hospital transfer (rung 4) as the climax mechanism: the move outside the walls is what makes the in-transit break-out (rung 5) possible.</w:t>
       </w:r>
     </w:p>
     <w:p>
@@ -658,7 +703,7 @@
         <w:spacing w:after="70" w:line="270"/>
       </w:pPr>
       <w:r>
-        <w:t xml:space="preserve">The psychologist arrives on contract, ulterior motive intact. He controls the inmate’s evaluation, meds, segregation, and parole prospects. </w:t>
+        <w:t xml:space="preserve">The psychologist arrives on contract, secret intact. He controls the inmate’s evaluation, meds, segregation, and prospects. </w:t>
       </w:r>
       <w:r>
         <w:rPr>
@@ -700,7 +745,7 @@
         <w:spacing w:after="70" w:line="270"/>
       </w:pPr>
       <w:r>
-        <w:t xml:space="preserve">The psychologist’s ‘due diligence’ becomes obsession: files, surveillance footage, the man’s whole pre-prison history, after-hours camera-watching. The investigation IS the stalking. </w:t>
+        <w:t xml:space="preserve">The psychologist’s ‘due diligence’ becomes obsession: files, scene photos, the man’s whole history, after-hours study. The investigation IS the stalking — and it lets him relive the work he envies. </w:t>
       </w:r>
       <w:r>
         <w:rPr>
@@ -721,6 +766,27 @@
         <w:spacing w:after="70" w:line="270"/>
       </w:pPr>
       <w:r>
+        <w:t xml:space="preserve">Seed the misattributed kills as an external mystery: the ‘partner’ murders the inmate swears aren’t his. The reader files it as the inmate’s denial — not knowing it’s the truth. </w:t>
+      </w:r>
+      <w:r>
+        <w:rPr>
+          <w:b/>
+          <w:bCs/>
+          <w:color w:val="7B1E22"/>
+        </w:rPr>
+        <w:t xml:space="preserve">[Mystery seed — for the midpoint]</w:t>
+      </w:r>
+    </w:p>
+    <w:p>
+      <w:pPr>
+        <w:pStyle w:val="ListParagraph"/>
+        <w:numPr>
+          <w:ilvl w:val="0"/>
+          <w:numId w:val="2"/>
+        </w:numPr>
+        <w:spacing w:after="70" w:line="270"/>
+      </w:pPr>
+      <w:r>
         <w:t xml:space="preserve">He breaks the inmate down in session under the banner of ‘therapeutic confrontation’ — the first taste of contempt-as-control. </w:t>
       </w:r>
       <w:r>
@@ -750,7 +816,28 @@
         <w:spacing w:after="70" w:line="270"/>
       </w:pPr>
       <w:r>
-        <w:t xml:space="preserve">The manipulation works too well; the psychologist is aroused by the control and by the inmate’s defiance. He falls — privately, against his own plan. </w:t>
+        <w:t xml:space="preserve">THE PHOTO SCENE: the psychologist shows the inmate crime-scene images of the ‘partner’ kills (his own work). The inmate coldly dissects them — insulted his name is on such trash — while the psychologist is undone at being seen and judged by the only mind that matches his. </w:t>
+      </w:r>
+      <w:r>
+        <w:rPr>
+          <w:b/>
+          <w:bCs/>
+          <w:color w:val="7B1E22"/>
+        </w:rPr>
+        <w:t xml:space="preserve">[Kindred Monster]</w:t>
+      </w:r>
+    </w:p>
+    <w:p>
+      <w:pPr>
+        <w:pStyle w:val="ListParagraph"/>
+        <w:numPr>
+          <w:ilvl w:val="0"/>
+          <w:numId w:val="2"/>
+        </w:numPr>
+        <w:spacing w:after="70" w:line="270"/>
+      </w:pPr>
+      <w:r>
+        <w:t xml:space="preserve">The manipulation works too well; he is aroused by the control and the defiance. He falls — privately, against his own plan. </w:t>
       </w:r>
       <w:r>
         <w:rPr>
@@ -771,28 +858,7 @@
         <w:spacing w:after="70" w:line="270"/>
       </w:pPr>
       <w:r>
-        <w:t xml:space="preserve">THE RECOGNITION (mid-book detonation): the inmate names what the psychologist is out loud — sees the predator under the mask. Intoxicating AND a mortal threat, because the inmate could expose him. Delay this card to here, not chapter one. </w:t>
-      </w:r>
-      <w:r>
-        <w:rPr>
-          <w:b/>
-          <w:bCs/>
-          <w:color w:val="7B1E22"/>
-        </w:rPr>
-        <w:t xml:space="preserve">[Kindred Monster]</w:t>
-      </w:r>
-    </w:p>
-    <w:p>
-      <w:pPr>
-        <w:pStyle w:val="ListParagraph"/>
-        <w:numPr>
-          <w:ilvl w:val="0"/>
-          <w:numId w:val="2"/>
-        </w:numPr>
-        <w:spacing w:after="70" w:line="270"/>
-      </w:pPr>
-      <w:r>
-        <w:t xml:space="preserve">Possession starts to override the contract; he begins protecting the inmate in small, deniable ways. </w:t>
+        <w:t xml:space="preserve">Possession starts to override the job; he begins protecting the inmate in small, deniable ways. </w:t>
       </w:r>
       <w:r>
         <w:rPr>
@@ -829,6 +895,56 @@
         <w:pStyle w:val="Heading2"/>
       </w:pPr>
       <w:r>
+        <w:t xml:space="preserve">MIDPOINT — The Gut-Punch</w:t>
+      </w:r>
+    </w:p>
+    <w:p>
+      <w:pPr>
+        <w:pStyle w:val="ListParagraph"/>
+        <w:numPr>
+          <w:ilvl w:val="0"/>
+          <w:numId w:val="2"/>
+        </w:numPr>
+        <w:spacing w:after="70" w:line="270"/>
+      </w:pPr>
+      <w:r>
+        <w:t xml:space="preserve">Reveal to the READER (not yet the inmate): the psychologist is the copycat. His sloppy kill is what caught the inmate; the man he is obsessing over is caged because of him. Every prior scene recolours. </w:t>
+      </w:r>
+      <w:r>
+        <w:rPr>
+          <w:b/>
+          <w:bCs/>
+          <w:color w:val="7B1E22"/>
+        </w:rPr>
+        <w:t xml:space="preserve">[Secret Identity — detonation]</w:t>
+      </w:r>
+    </w:p>
+    <w:p>
+      <w:pPr>
+        <w:pStyle w:val="ListParagraph"/>
+        <w:numPr>
+          <w:ilvl w:val="0"/>
+          <w:numId w:val="2"/>
+        </w:numPr>
+        <w:spacing w:after="70" w:line="270"/>
+      </w:pPr>
+      <w:r>
+        <w:t xml:space="preserve">The mode flips from cat-and-mouse to dread: the whole back half is the question of WHEN the inmate finds out — and what the psychologist will do to stop it. </w:t>
+      </w:r>
+      <w:r>
+        <w:rPr>
+          <w:b/>
+          <w:bCs/>
+          <w:color w:val="7B1E22"/>
+        </w:rPr>
+        <w:t xml:space="preserve">[Dread engine]</w:t>
+      </w:r>
+    </w:p>
+    <w:p>
+      <w:pPr>
+        <w:pStyle w:val="Heading2"/>
+      </w:pPr>
+      <w:r>
         <w:t xml:space="preserve">Act 2B — Touch Him and Die (Kill #1)</w:t>
       </w:r>
     </w:p>
@@ -863,7 +979,7 @@
         <w:spacing w:after="70" w:line="270"/>
       </w:pPr>
       <w:r>
-        <w:t xml:space="preserve">The psychologist engineers the attacker’s death using what a psychologist plausibly controls — a doctored psych record that gets him moved somewhere fatal, falsified meds, or leverage over a third inmate via confessions from session. </w:t>
+        <w:t xml:space="preserve">He engineers the attacker’s death using what a psychologist plausibly controls — a doctored record that gets him moved somewhere fatal, falsified meds, or leverage over a third inmate via session confessions. </w:t>
       </w:r>
       <w:r>
         <w:rPr>
@@ -884,7 +1000,7 @@
         <w:spacing w:after="70" w:line="270"/>
       </w:pPr>
       <w:r>
-        <w:t xml:space="preserve">The attacker simply vanishes from the wing. The inmate begins to understand what the psychologist is — and is more drawn to him, not less. </w:t>
+        <w:t xml:space="preserve">The attacker vanishes from the wing. The inmate begins to understand what the psychologist is — and is more drawn to him, not less. </w:t>
       </w:r>
       <w:r>
         <w:rPr>
@@ -900,7 +1016,7 @@
         <w:pStyle w:val="Heading2"/>
       </w:pPr>
       <w:r>
-        <w:t xml:space="preserve">Act 3 — Captivity, Dependency, Kill #2</w:t>
+        <w:t xml:space="preserve">Act 3 — Captivity, Dependency, Kill #2, Closing Net</w:t>
       </w:r>
     </w:p>
     <w:p>
@@ -934,49 +1050,28 @@
         <w:spacing w:after="70" w:line="270"/>
       </w:pPr>
       <w:r>
-        <w:t xml:space="preserve">The clinical wing tightens the cage: the psychologist is closer to the keys than any guard. </w:t>
-      </w:r>
-      <w:r>
-        <w:rPr>
-          <w:b/>
-          <w:bCs/>
-          <w:color w:val="7B1E22"/>
-        </w:rPr>
-        <w:t xml:space="preserve">[Captive / Captor]</w:t>
-      </w:r>
-    </w:p>
-    <w:p>
-      <w:pPr>
-        <w:pStyle w:val="ListParagraph"/>
-        <w:numPr>
-          <w:ilvl w:val="0"/>
-          <w:numId w:val="2"/>
-        </w:numPr>
-        <w:spacing w:after="70" w:line="270"/>
-      </w:pPr>
-      <w:r>
-        <w:t xml:space="preserve">Their dynamic deepens — the age and authority gap charges every exchange; degradation now reads as twisted intimacy rather than cruelty. </w:t>
-      </w:r>
-      <w:r>
-        <w:rPr>
-          <w:b/>
-          <w:bCs/>
-          <w:color w:val="7B1E22"/>
-        </w:rPr>
-        <w:t xml:space="preserve">[Age Gap] [Degradation]</w:t>
-      </w:r>
-    </w:p>
-    <w:p>
-      <w:pPr>
-        <w:pStyle w:val="ListParagraph"/>
-        <w:numPr>
-          <w:ilvl w:val="0"/>
-          <w:numId w:val="2"/>
-        </w:numPr>
-        <w:spacing w:after="70" w:line="270"/>
-      </w:pPr>
-      <w:r>
-        <w:t xml:space="preserve">The officer clocks the dynamic, reprimands the psychologist, and slams the inmate into solitary out of spite — custody overriding clinical. The psychologist takes him out (parking-lot hit-and-run, or a staged overdose / tampered insulin for deniability). Higher risk — an official — which brings the heat that drives Act 4. </w:t>
+        <w:t xml:space="preserve">The clinical wing tightens the cage: the psychologist is closer to the keys than any guard. The age and authority gap charges every exchange; degradation now reads as twisted intimacy. </w:t>
+      </w:r>
+      <w:r>
+        <w:rPr>
+          <w:b/>
+          <w:bCs/>
+          <w:color w:val="7B1E22"/>
+        </w:rPr>
+        <w:t xml:space="preserve">[Captive/Captor] [Age Gap] [Degradation]</w:t>
+      </w:r>
+    </w:p>
+    <w:p>
+      <w:pPr>
+        <w:pStyle w:val="ListParagraph"/>
+        <w:numPr>
+          <w:ilvl w:val="0"/>
+          <w:numId w:val="2"/>
+        </w:numPr>
+        <w:spacing w:after="70" w:line="270"/>
+      </w:pPr>
+      <w:r>
+        <w:t xml:space="preserve">The officer clocks the dynamic, reprimands him, and slams the inmate into solitary out of spite — custody overriding clinical. The psychologist takes him out (staged overdose / tampered insulin for deniability). </w:t>
       </w:r>
       <w:r>
         <w:rPr>
@@ -989,23 +1084,44 @@
     </w:p>
     <w:p>
       <w:pPr>
+        <w:pStyle w:val="ListParagraph"/>
+        <w:numPr>
+          <w:ilvl w:val="0"/>
+          <w:numId w:val="2"/>
+        </w:numPr>
+        <w:spacing w:after="70" w:line="270"/>
+      </w:pPr>
+      <w:r>
+        <w:t xml:space="preserve">The detective’s investigation tightens — the fresh kills carry the inmate’s signature, but the inmate is locked up, so the copycat must be outside. The net begins to close on the psychologist. </w:t>
+      </w:r>
+      <w:r>
+        <w:rPr>
+          <w:b/>
+          <w:bCs/>
+          <w:color w:val="7B1E22"/>
+        </w:rPr>
+        <w:t xml:space="preserve">[Dread / series nemesis]</w:t>
+      </w:r>
+    </w:p>
+    <w:p>
+      <w:pPr>
         <w:pStyle w:val="Heading2"/>
       </w:pPr>
       <w:r>
-        <w:t xml:space="preserve">Act 4 — The Reveal &amp; Black Moment</w:t>
-      </w:r>
-    </w:p>
-    <w:p>
-      <w:pPr>
-        <w:pStyle w:val="ListParagraph"/>
-        <w:numPr>
-          <w:ilvl w:val="0"/>
-          <w:numId w:val="2"/>
-        </w:numPr>
-        <w:spacing w:after="70" w:line="270"/>
-      </w:pPr>
-      <w:r>
-        <w:t xml:space="preserve">The inmate (or an investigator) uncovers the paid-to-destroy contract and the revenge motive. Betrayal: it was all manipulation. Enemies snaps back to enemies. </w:t>
+        <w:t xml:space="preserve">Act 4 — The Black Moment (the Inmate Finds Out)</w:t>
+      </w:r>
+    </w:p>
+    <w:p>
+      <w:pPr>
+        <w:pStyle w:val="ListParagraph"/>
+        <w:numPr>
+          <w:ilvl w:val="0"/>
+          <w:numId w:val="2"/>
+        </w:numPr>
+        <w:spacing w:after="70" w:line="270"/>
+      </w:pPr>
+      <w:r>
+        <w:t xml:space="preserve">The inmate discovers the truth: the man feeding, protecting, and obsessing over him is the copycat — the reason he is in a cage. Total betrayal; enemies snaps back to enemies. </w:t>
       </w:r>
       <w:r>
         <w:rPr>
@@ -1026,7 +1142,15 @@
         <w:spacing w:after="70" w:line="270"/>
       </w:pPr>
       <w:r>
-        <w:t xml:space="preserve">Simultaneously the psychologist learns the truth: the inmate is innocent / justified, and the Employer is the real killer. His revenge was aimed at the wrong man.</w:t>
+        <w:t xml:space="preserve">But they are the same animal. After the rage, the betrayal curdles into the deepest intimacy either has known: the psychologist is the only one who ever truly saw him — and he chose him over self-preservation. </w:t>
+      </w:r>
+      <w:r>
+        <w:rPr>
+          <w:b/>
+          <w:bCs/>
+          <w:color w:val="7B1E22"/>
+        </w:rPr>
+        <w:t xml:space="preserve">[Kindred Monster — payoff]</w:t>
       </w:r>
     </w:p>
     <w:p>
@@ -1034,41 +1158,41 @@
         <w:pStyle w:val="Heading2"/>
       </w:pPr>
       <w:r>
-        <w:t xml:space="preserve">Act 5 — Bad Together (Dark HEA)</w:t>
-      </w:r>
-    </w:p>
-    <w:p>
-      <w:pPr>
-        <w:pStyle w:val="ListParagraph"/>
-        <w:numPr>
-          <w:ilvl w:val="0"/>
-          <w:numId w:val="2"/>
-        </w:numPr>
-        <w:spacing w:after="70" w:line="270"/>
-      </w:pPr>
-      <w:r>
-        <w:t xml:space="preserve">The psychologist chooses the inmate over the payout and the revenge. He weaponises his expertise to overturn the conviction — discrediting evidence, exposing the Employer, expert testimony. </w:t>
-      </w:r>
-      <w:r>
-        <w:rPr>
-          <w:b/>
-          <w:bCs/>
-          <w:color w:val="7B1E22"/>
-        </w:rPr>
-        <w:t xml:space="preserve">[Captive/Captor → resolution]</w:t>
-      </w:r>
-    </w:p>
-    <w:p>
-      <w:pPr>
-        <w:pStyle w:val="ListParagraph"/>
-        <w:numPr>
-          <w:ilvl w:val="0"/>
-          <w:numId w:val="2"/>
-        </w:numPr>
-        <w:spacing w:after="70" w:line="270"/>
-      </w:pPr>
-      <w:r>
-        <w:t xml:space="preserve">Dark HEA: they end up together, both morally bankrupt and bonded by it (Bonnie-and-Clyde energy). Optional capstone: the inmate freed into the psychologist’s supervised custody — the captor dynamic persists by choice. </w:t>
+        <w:t xml:space="preserve">Act 5 — A Killing Pair (Dark HEA)</w:t>
+      </w:r>
+    </w:p>
+    <w:p>
+      <w:pPr>
+        <w:pStyle w:val="ListParagraph"/>
+        <w:numPr>
+          <w:ilvl w:val="0"/>
+          <w:numId w:val="2"/>
+        </w:numPr>
+        <w:spacing w:after="70" w:line="270"/>
+      </w:pPr>
+      <w:r>
+        <w:t xml:space="preserve">With the detective closing in and the state moving the inmate to a secure hospital, the psychologist engineers the break-out in transit — sacrificing his cover and his freedom to get him out. </w:t>
+      </w:r>
+      <w:r>
+        <w:rPr>
+          <w:b/>
+          <w:bCs/>
+          <w:color w:val="7B1E22"/>
+        </w:rPr>
+        <w:t xml:space="preserve">[Captive/Captor → liberation]</w:t>
+      </w:r>
+    </w:p>
+    <w:p>
+      <w:pPr>
+        <w:pStyle w:val="ListParagraph"/>
+        <w:numPr>
+          <w:ilvl w:val="0"/>
+          <w:numId w:val="2"/>
+        </w:numPr>
+        <w:spacing w:after="70" w:line="270"/>
+      </w:pPr>
+      <w:r>
+        <w:t xml:space="preserve">Dark HEA: they vanish together — folie à deux, two monsters loose, bonded by blood and by being the only ones who understand each other. The detective is left on their trail, seeding the series. </w:t>
       </w:r>
       <w:r>
         <w:rPr>
@@ -1233,7 +1357,7 @@
                 <w:bCs w:val="false"/>
                 <w:color w:val="000000"/>
               </w:rPr>
-              <w:t xml:space="preserve">Premise — the psychologist controls evaluation, meds, segregation, parole (Act 1 onward).</w:t>
+              <w:t xml:space="preserve">Premise — the psychologist controls evaluation, meds, segregation, prospects (Act 1 onward).</w:t>
             </w:r>
           </w:p>
         </w:tc>
@@ -1266,7 +1390,7 @@
                 <w:bCs w:val="false"/>
                 <w:color w:val="000000"/>
               </w:rPr>
-              <w:t xml:space="preserve">Enemies to Lovers</w:t>
+              <w:t xml:space="preserve">Secret Identity / the Copycat</w:t>
             </w:r>
           </w:p>
         </w:tc>
@@ -1294,7 +1418,7 @@
                 <w:bCs w:val="false"/>
                 <w:color w:val="000000"/>
               </w:rPr>
-              <w:t xml:space="preserve">Hostile Act 1 → betrayal black moment Act 4 (two adversarial peaks).</w:t>
+              <w:t xml:space="preserve">The engine. Reader learns it at the MIDPOINT; the inmate learns it at the Act 4 black moment.</w:t>
             </w:r>
           </w:p>
         </w:tc>
@@ -1327,7 +1451,7 @@
                 <w:bCs w:val="false"/>
                 <w:color w:val="000000"/>
               </w:rPr>
-              <w:t xml:space="preserve">Stalker Romance</w:t>
+              <w:t xml:space="preserve">Enemies to Lovers</w:t>
             </w:r>
           </w:p>
         </w:tc>
@@ -1355,7 +1479,7 @@
                 <w:bCs w:val="false"/>
                 <w:color w:val="000000"/>
               </w:rPr>
-              <w:t xml:space="preserve">File / footage / history obsession; after-hours camera-watching (Act 1–2).</w:t>
+              <w:t xml:space="preserve">Hostile Act 1 → the inmate’s discovery (Act 4) as the betrayal black moment (two adversarial peaks).</w:t>
             </w:r>
           </w:p>
         </w:tc>
@@ -1388,6 +1512,67 @@
                 <w:bCs w:val="false"/>
                 <w:color w:val="000000"/>
               </w:rPr>
+              <w:t xml:space="preserve">Stalker Romance</w:t>
+            </w:r>
+          </w:p>
+        </w:tc>
+        <w:tc>
+          <w:tcPr>
+            <w:tcW w:type="dxa" w:w="6160"/>
+            <w:tcBorders>
+              <w:top w:val="single" w:color="C9B8B9" w:sz="1"/>
+              <w:left w:val="single" w:color="C9B8B9" w:sz="1"/>
+              <w:bottom w:val="single" w:color="C9B8B9" w:sz="1"/>
+              <w:right w:val="single" w:color="C9B8B9" w:sz="1"/>
+            </w:tcBorders>
+            <w:shd w:fill="FFFFFF" w:val="clear"/>
+            <w:tcMar>
+              <w:top w:type="dxa" w:w="70"/>
+              <w:left w:type="dxa" w:w="110"/>
+              <w:bottom w:type="dxa" w:w="70"/>
+              <w:right w:type="dxa" w:w="110"/>
+            </w:tcMar>
+          </w:tcPr>
+          <w:p>
+            <w:r>
+              <w:rPr>
+                <w:b w:val="false"/>
+                <w:bCs w:val="false"/>
+                <w:color w:val="000000"/>
+              </w:rPr>
+              <w:t xml:space="preserve">File / scene-photo / history obsession; after-hours study (Act 1–2).</w:t>
+            </w:r>
+          </w:p>
+        </w:tc>
+      </w:tr>
+      <w:tr>
+        <w:trPr>
+          <w:tblHeader w:val="false"/>
+        </w:trPr>
+        <w:tc>
+          <w:tcPr>
+            <w:tcW w:type="dxa" w:w="2600"/>
+            <w:tcBorders>
+              <w:top w:val="single" w:color="C9B8B9" w:sz="1"/>
+              <w:left w:val="single" w:color="C9B8B9" w:sz="1"/>
+              <w:bottom w:val="single" w:color="C9B8B9" w:sz="1"/>
+              <w:right w:val="single" w:color="C9B8B9" w:sz="1"/>
+            </w:tcBorders>
+            <w:shd w:fill="EFE6E7" w:val="clear"/>
+            <w:tcMar>
+              <w:top w:type="dxa" w:w="70"/>
+              <w:left w:type="dxa" w:w="110"/>
+              <w:bottom w:type="dxa" w:w="70"/>
+              <w:right w:type="dxa" w:w="110"/>
+            </w:tcMar>
+          </w:tcPr>
+          <w:p>
+            <w:r>
+              <w:rPr>
+                <w:b w:val="false"/>
+                <w:bCs w:val="false"/>
+                <w:color w:val="000000"/>
+              </w:rPr>
               <w:t xml:space="preserve">Obsessive / Possessive Hero</w:t>
             </w:r>
           </w:p>
@@ -1401,7 +1586,7 @@
               <w:bottom w:val="single" w:color="C9B8B9" w:sz="1"/>
               <w:right w:val="single" w:color="C9B8B9" w:sz="1"/>
             </w:tcBorders>
-            <w:shd w:fill="FFFFFF" w:val="clear"/>
+            <w:shd w:fill="EFE6E7" w:val="clear"/>
             <w:tcMar>
               <w:top w:type="dxa" w:w="70"/>
               <w:left w:type="dxa" w:w="110"/>
@@ -1434,7 +1619,7 @@
               <w:bottom w:val="single" w:color="C9B8B9" w:sz="1"/>
               <w:right w:val="single" w:color="C9B8B9" w:sz="1"/>
             </w:tcBorders>
-            <w:shd w:fill="EFE6E7" w:val="clear"/>
+            <w:shd w:fill="FFFFFF" w:val="clear"/>
             <w:tcMar>
               <w:top w:type="dxa" w:w="70"/>
               <w:left w:type="dxa" w:w="110"/>
@@ -1462,7 +1647,7 @@
               <w:bottom w:val="single" w:color="C9B8B9" w:sz="1"/>
               <w:right w:val="single" w:color="C9B8B9" w:sz="1"/>
             </w:tcBorders>
-            <w:shd w:fill="EFE6E7" w:val="clear"/>
+            <w:shd w:fill="FFFFFF" w:val="clear"/>
             <w:tcMar>
               <w:top w:type="dxa" w:w="70"/>
               <w:left w:type="dxa" w:w="110"/>
@@ -1495,7 +1680,7 @@
               <w:bottom w:val="single" w:color="C9B8B9" w:sz="1"/>
               <w:right w:val="single" w:color="C9B8B9" w:sz="1"/>
             </w:tcBorders>
-            <w:shd w:fill="FFFFFF" w:val="clear"/>
+            <w:shd w:fill="EFE6E7" w:val="clear"/>
             <w:tcMar>
               <w:top w:type="dxa" w:w="70"/>
               <w:left w:type="dxa" w:w="110"/>
@@ -1523,6 +1708,39 @@
               <w:bottom w:val="single" w:color="C9B8B9" w:sz="1"/>
               <w:right w:val="single" w:color="C9B8B9" w:sz="1"/>
             </w:tcBorders>
+            <w:shd w:fill="EFE6E7" w:val="clear"/>
+            <w:tcMar>
+              <w:top w:type="dxa" w:w="70"/>
+              <w:left w:type="dxa" w:w="110"/>
+              <w:bottom w:type="dxa" w:w="70"/>
+              <w:right w:type="dxa" w:w="110"/>
+            </w:tcMar>
+          </w:tcPr>
+          <w:p>
+            <w:r>
+              <w:rPr>
+                <w:b w:val="false"/>
+                <w:bCs w:val="false"/>
+                <w:color w:val="000000"/>
+              </w:rPr>
+              <w:t xml:space="preserve">The photo scene (2A) ignites it; the betrayal payoff (Act 4) deepens it; it powers the killing-pair HEA.</w:t>
+            </w:r>
+          </w:p>
+        </w:tc>
+      </w:tr>
+      <w:tr>
+        <w:trPr>
+          <w:tblHeader w:val="false"/>
+        </w:trPr>
+        <w:tc>
+          <w:tcPr>
+            <w:tcW w:type="dxa" w:w="2600"/>
+            <w:tcBorders>
+              <w:top w:val="single" w:color="C9B8B9" w:sz="1"/>
+              <w:left w:val="single" w:color="C9B8B9" w:sz="1"/>
+              <w:bottom w:val="single" w:color="C9B8B9" w:sz="1"/>
+              <w:right w:val="single" w:color="C9B8B9" w:sz="1"/>
+            </w:tcBorders>
             <w:shd w:fill="FFFFFF" w:val="clear"/>
             <w:tcMar>
               <w:top w:type="dxa" w:w="70"/>
@@ -1538,7 +1756,35 @@
                 <w:bCs w:val="false"/>
                 <w:color w:val="000000"/>
               </w:rPr>
-              <w:t xml:space="preserve">Both leads are lethal; the mid-book recognition (Act 2A) detonates the dynamic and powers the 'bad together' HEA.</w:t>
+              <w:t xml:space="preserve">Captive / Captor</w:t>
+            </w:r>
+          </w:p>
+        </w:tc>
+        <w:tc>
+          <w:tcPr>
+            <w:tcW w:type="dxa" w:w="6160"/>
+            <w:tcBorders>
+              <w:top w:val="single" w:color="C9B8B9" w:sz="1"/>
+              <w:left w:val="single" w:color="C9B8B9" w:sz="1"/>
+              <w:bottom w:val="single" w:color="C9B8B9" w:sz="1"/>
+              <w:right w:val="single" w:color="C9B8B9" w:sz="1"/>
+            </w:tcBorders>
+            <w:shd w:fill="FFFFFF" w:val="clear"/>
+            <w:tcMar>
+              <w:top w:type="dxa" w:w="70"/>
+              <w:left w:type="dxa" w:w="110"/>
+              <w:bottom w:type="dxa" w:w="70"/>
+              <w:right w:type="dxa" w:w="110"/>
+            </w:tcMar>
+          </w:tcPr>
+          <w:p>
+            <w:r>
+              <w:rPr>
+                <w:b w:val="false"/>
+                <w:bCs w:val="false"/>
+                <w:color w:val="000000"/>
+              </w:rPr>
+              <w:t xml:space="preserve">Prison → Mental Health Unit → in-transit break-out (the escalation ladder).</w:t>
             </w:r>
           </w:p>
         </w:tc>
@@ -1571,7 +1817,7 @@
                 <w:bCs w:val="false"/>
                 <w:color w:val="000000"/>
               </w:rPr>
-              <w:t xml:space="preserve">Captive / Captor</w:t>
+              <w:t xml:space="preserve">Age Gap</w:t>
             </w:r>
           </w:p>
         </w:tc>
@@ -1599,7 +1845,7 @@
                 <w:bCs w:val="false"/>
                 <w:color w:val="000000"/>
               </w:rPr>
-              <w:t xml:space="preserve">Prison captivity → Mental Health Unit → supervised-custody ending (the escalation ladder).</w:t>
+              <w:t xml:space="preserve">Mid-40s / late-20s, reinforced by the authority dynamic (Act 3).</w:t>
             </w:r>
           </w:p>
         </w:tc>
@@ -1632,7 +1878,7 @@
                 <w:bCs w:val="false"/>
                 <w:color w:val="000000"/>
               </w:rPr>
-              <w:t xml:space="preserve">Age Gap</w:t>
+              <w:t xml:space="preserve">Stockholm Syndrome</w:t>
             </w:r>
           </w:p>
         </w:tc>
@@ -1660,7 +1906,7 @@
                 <w:bCs w:val="false"/>
                 <w:color w:val="000000"/>
               </w:rPr>
-              <w:t xml:space="preserve">Mid-40s / late-20s, reinforced by the authority dynamic (Act 3).</w:t>
+              <w:t xml:space="preserve">Act 3 dependency — the psychologist as sole protector and human contact.</w:t>
             </w:r>
           </w:p>
         </w:tc>
@@ -1693,7 +1939,7 @@
                 <w:bCs w:val="false"/>
                 <w:color w:val="000000"/>
               </w:rPr>
-              <w:t xml:space="preserve">Stockholm Syndrome</w:t>
+              <w:t xml:space="preserve">Touch Him and Die</w:t>
             </w:r>
           </w:p>
         </w:tc>
@@ -1721,7 +1967,7 @@
                 <w:bCs w:val="false"/>
                 <w:color w:val="000000"/>
               </w:rPr>
-              <w:t xml:space="preserve">Act 3 dependency — the psychologist as sole protector and human contact.</w:t>
+              <w:t xml:space="preserve">Kill 1 (attacker, Act 2B) + Kill 2 (the officer, Act 3) — escalation ladder.</w:t>
             </w:r>
           </w:p>
         </w:tc>
@@ -1754,7 +2000,7 @@
                 <w:bCs w:val="false"/>
                 <w:color w:val="000000"/>
               </w:rPr>
-              <w:t xml:space="preserve">Touch Him and Die</w:t>
+              <w:t xml:space="preserve">Degradation (kink)</w:t>
             </w:r>
           </w:p>
         </w:tc>
@@ -1782,7 +2028,7 @@
                 <w:bCs w:val="false"/>
                 <w:color w:val="000000"/>
               </w:rPr>
-              <w:t xml:space="preserve">Kill 1 (attacker, Act 2B) + Kill 2 (the officer, Act 3) — escalation ladder.</w:t>
+              <w:t xml:space="preserve">Seeded as ‘therapeutic confrontation’ (Act 1); recurs as twisted intimacy (Act 3).</w:t>
             </w:r>
           </w:p>
         </w:tc>
@@ -1815,7 +2061,7 @@
                 <w:bCs w:val="false"/>
                 <w:color w:val="000000"/>
               </w:rPr>
-              <w:t xml:space="preserve">Degradation (kink)</w:t>
+              <w:t xml:space="preserve">Dubcon — power / manipulation / intoxication / captivity</w:t>
             </w:r>
           </w:p>
         </w:tc>
@@ -1843,67 +2089,6 @@
                 <w:bCs w:val="false"/>
                 <w:color w:val="000000"/>
               </w:rPr>
-              <w:t xml:space="preserve">Seeded as ‘therapeutic confrontation’ (Act 1); recurs as twisted intimacy (Act 3).</w:t>
-            </w:r>
-          </w:p>
-        </w:tc>
-      </w:tr>
-      <w:tr>
-        <w:trPr>
-          <w:tblHeader w:val="false"/>
-        </w:trPr>
-        <w:tc>
-          <w:tcPr>
-            <w:tcW w:type="dxa" w:w="2600"/>
-            <w:tcBorders>
-              <w:top w:val="single" w:color="C9B8B9" w:sz="1"/>
-              <w:left w:val="single" w:color="C9B8B9" w:sz="1"/>
-              <w:bottom w:val="single" w:color="C9B8B9" w:sz="1"/>
-              <w:right w:val="single" w:color="C9B8B9" w:sz="1"/>
-            </w:tcBorders>
-            <w:shd w:fill="FFFFFF" w:val="clear"/>
-            <w:tcMar>
-              <w:top w:type="dxa" w:w="70"/>
-              <w:left w:type="dxa" w:w="110"/>
-              <w:bottom w:type="dxa" w:w="70"/>
-              <w:right w:type="dxa" w:w="110"/>
-            </w:tcMar>
-          </w:tcPr>
-          <w:p>
-            <w:r>
-              <w:rPr>
-                <w:b w:val="false"/>
-                <w:bCs w:val="false"/>
-                <w:color w:val="000000"/>
-              </w:rPr>
-              <w:t xml:space="preserve">Dubcon — power / manipulation / intoxication / captivity</w:t>
-            </w:r>
-          </w:p>
-        </w:tc>
-        <w:tc>
-          <w:tcPr>
-            <w:tcW w:type="dxa" w:w="6160"/>
-            <w:tcBorders>
-              <w:top w:val="single" w:color="C9B8B9" w:sz="1"/>
-              <w:left w:val="single" w:color="C9B8B9" w:sz="1"/>
-              <w:bottom w:val="single" w:color="C9B8B9" w:sz="1"/>
-              <w:right w:val="single" w:color="C9B8B9" w:sz="1"/>
-            </w:tcBorders>
-            <w:shd w:fill="FFFFFF" w:val="clear"/>
-            <w:tcMar>
-              <w:top w:type="dxa" w:w="70"/>
-              <w:left w:type="dxa" w:w="110"/>
-              <w:bottom w:type="dxa" w:w="70"/>
-              <w:right w:type="dxa" w:w="110"/>
-            </w:tcMar>
-          </w:tcPr>
-          <w:p>
-            <w:r>
-              <w:rPr>
-                <w:b w:val="false"/>
-                <w:bCs w:val="false"/>
-                <w:color w:val="000000"/>
-              </w:rPr>
               <w:t xml:space="preserve">All four vectors present; first beat under sedation + total power asymmetry (Act 2A).</w:t>
             </w:r>
           </w:p>
@@ -1954,7 +2139,7 @@
         <w:spacing w:after="70" w:line="270"/>
       </w:pPr>
       <w:r>
-        <w:t xml:space="preserve">Protect the ‘redeemability line.’ Readers will let the psychologist murder freely — but the one near-universal hard no is an MMC who is irredeemable TO THE LOVE INTEREST with no arc. His cruelty toward the inmate must always have the obsession/devotion readable underneath, and the Act-4 reveal (he turns on his Employer FOR the inmate) is what buys the villain back.</w:t>
+        <w:t xml:space="preserve">Protect the ‘redeemability line.’ Readers will let the psychologist murder freely — but the near-universal hard no is an MMC who wrongs the LOVE INTEREST with no reckoning. He is literally the reason the inmate is caged, so the buy-back must be enormous: at the climax he sacrifices his cover, his freedom, and his safety to break the inmate out. Devotion must be readable under the cruelty the whole way through.</w:t>
       </w:r>
     </w:p>
     <w:p>
@@ -1967,7 +2152,7 @@
         <w:spacing w:after="70" w:line="270"/>
       </w:pPr>
       <w:r>
-        <w:t xml:space="preserve">Earn the Stockholm. Give the inmate agency and intelligence so his attachment reads as a survivor adapting to (and eventually turning) his captor — not passivity. The most satisfying version: by the end, the inmate is as dangerous as the psychologist.</w:t>
+        <w:t xml:space="preserve">Make the midpoint reveal fair on the reread. Because the secret is hidden from the reader until the midpoint, seed clues that only resolve on a second read: his ‘expert’ familiarity with scene details never released to the public; a flicker of pride when the inmate praises the ‘partner’s’ nerve; his too-specific knowledge in the photo scene. The first read should land as a gut-punch; the reread should feel inevitable.</w:t>
       </w:r>
     </w:p>
     <w:p>
@@ -1980,7 +2165,20 @@
         <w:spacing w:after="70" w:line="270"/>
       </w:pPr>
       <w:r>
-        <w:t xml:space="preserve">Delay the recognition. The kindred-monster reveal is your best card — let the psychologist deny it (‘I am only clinically interested’) while the inmate needles and tests him, the mask cracking session by session. Spend it mid-book, never in chapter one. Two monsters who clock each other on page one have nowhere left to go.</w:t>
+        <w:t xml:space="preserve">Earn the Stockholm. Give the inmate agency and intelligence so his attachment reads as a predator sizing up an equal — not passivity. He is already as dangerous as the psychologist; the arc is two monsters recognising each other, not a victim breaking.</w:t>
+      </w:r>
+    </w:p>
+    <w:p>
+      <w:pPr>
+        <w:pStyle w:val="ListParagraph"/>
+        <w:numPr>
+          <w:ilvl w:val="0"/>
+          <w:numId w:val="3"/>
+        </w:numPr>
+        <w:spacing w:after="70" w:line="270"/>
+      </w:pPr>
+      <w:r>
+        <w:t xml:space="preserve">Engineer the dissociative POV. To withhold the secret honestly from inside his head, write him as compartmentalised — he genuinely does not let himself think the one fact. This is gorgeous for a self-deceiving clinician, and it means the reread shows a man lying to himself, not an author lying to the reader.</w:t>
       </w:r>
     </w:p>
     <w:p>
@@ -2014,7 +2212,7 @@
         <w:spacing w:after="70" w:line="270"/>
       </w:pPr>
       <w:r>
-        <w:t xml:space="preserve">Content / trigger warnings before the prologue. Standard reader expectation. List, at minimum: dubcon, on-page murder, drugging/intoxication, captivity, degradation, abuse of professional power.</w:t>
+        <w:t xml:space="preserve">Content / trigger warnings before the prologue. Standard reader expectation. List, at minimum: serial murder, on-page murder, dubcon, drugging/intoxication, captivity, degradation, abuse of professional power.</w:t>
       </w:r>
     </w:p>
     <w:p>
@@ -2048,7 +2246,20 @@
         <w:spacing w:after="70" w:line="270"/>
       </w:pPr>
       <w:r>
-        <w:t xml:space="preserve">The Employer is your bridge — a crime family / fixer / institution that recurs. Their downfall here sets up Book 2.</w:t>
+        <w:t xml:space="preserve">The Detective is your bridge — left on the trail of the vanished killing pair, a recurring nemesis whose pursuit can thread through the series.</w:t>
+      </w:r>
+    </w:p>
+    <w:p>
+      <w:pPr>
+        <w:pStyle w:val="ListParagraph"/>
+        <w:numPr>
+          <w:ilvl w:val="0"/>
+          <w:numId w:val="2"/>
+        </w:numPr>
+        <w:spacing w:after="70" w:line="270"/>
+      </w:pPr>
+      <w:r>
+        <w:t xml:space="preserve">The killing pair on the run is its own engine: future books can track their life outside, fresh kills, and the net always tightening.</w:t>
       </w:r>
     </w:p>
     <w:p>
@@ -2074,20 +2285,7 @@
         <w:spacing w:after="70" w:line="270"/>
       </w:pPr>
       <w:r>
-        <w:t xml:space="preserve">The psychologist’s ‘fixer’ skill set — clean kills via clinical access — makes him a cameo-able series antihero others fear or hire.</w:t>
-      </w:r>
-    </w:p>
-    <w:p>
-      <w:pPr>
-        <w:pStyle w:val="ListParagraph"/>
-        <w:numPr>
-          <w:ilvl w:val="0"/>
-          <w:numId w:val="2"/>
-        </w:numPr>
-        <w:spacing w:after="70" w:line="270"/>
-      </w:pPr>
-      <w:r>
-        <w:t xml:space="preserve">Rung 4 (the forensic psychiatric hospital) is a ready-made setting for a future standalone.</w:t>
+        <w:t xml:space="preserve">The psychologist’s skill set — clean kills via clinical access — makes him a cameo-able series antihero others fear.</w:t>
       </w:r>
     </w:p>
     <w:p>
@@ -2108,33 +2306,46 @@
         <w:spacing w:after="70" w:line="270"/>
       </w:pPr>
       <w:r>
-        <w:t xml:space="preserve">Lock ages and the exact nature of the ‘person the psychologist knew’ (this controls the emotional stakes of the twist).</w:t>
-      </w:r>
-    </w:p>
-    <w:p>
-      <w:pPr>
-        <w:pStyle w:val="ListParagraph"/>
-        <w:numPr>
-          <w:ilvl w:val="0"/>
-          <w:numId w:val="2"/>
-        </w:numPr>
-        <w:spacing w:after="70" w:line="270"/>
-      </w:pPr>
-      <w:r>
-        <w:t xml:space="preserve">Expand this beat sheet into a 30–40 chapter outline.</w:t>
-      </w:r>
-    </w:p>
-    <w:p>
-      <w:pPr>
-        <w:pStyle w:val="ListParagraph"/>
-        <w:numPr>
-          <w:ilvl w:val="0"/>
-          <w:numId w:val="2"/>
-        </w:numPr>
-        <w:spacing w:after="70" w:line="270"/>
-      </w:pPr>
-      <w:r>
-        <w:t xml:space="preserve">Draft Chapter 1 to lock the clinical-predator voice.</w:t>
+        <w:t xml:space="preserve">Decide how the inmate discovers the truth in Act 4 (a slip in the photo scene, the detective’s file, a trophy) — it sets the black-moment temperature.</w:t>
+      </w:r>
+    </w:p>
+    <w:p>
+      <w:pPr>
+        <w:pStyle w:val="ListParagraph"/>
+        <w:numPr>
+          <w:ilvl w:val="0"/>
+          <w:numId w:val="2"/>
+        </w:numPr>
+        <w:spacing w:after="70" w:line="270"/>
+      </w:pPr>
+      <w:r>
+        <w:t xml:space="preserve">Choose the copycat mechanics: did the psychologist deliberately mimic the inmate’s signature, or did his own impulsive kill happen to read as the inmate’s? (Deliberate = colder; coincidental = more tragic.)</w:t>
+      </w:r>
+    </w:p>
+    <w:p>
+      <w:pPr>
+        <w:pStyle w:val="ListParagraph"/>
+        <w:numPr>
+          <w:ilvl w:val="0"/>
+          <w:numId w:val="2"/>
+        </w:numPr>
+        <w:spacing w:after="70" w:line="270"/>
+      </w:pPr>
+      <w:r>
+        <w:t xml:space="preserve">Draft the PHOTO SCENE first — it is the spine of the book and will lock the clinical-predator voice.</w:t>
+      </w:r>
+    </w:p>
+    <w:p>
+      <w:pPr>
+        <w:pStyle w:val="ListParagraph"/>
+        <w:numPr>
+          <w:ilvl w:val="0"/>
+          <w:numId w:val="2"/>
+        </w:numPr>
+        <w:spacing w:after="70" w:line="270"/>
+      </w:pPr>
+      <w:r>
+        <w:t xml:space="preserve">Expand this beat sheet into a 30–40 chapter outline, marking exactly where the midpoint reveal lands.</w:t>
       </w:r>
     </w:p>
     <w:p>

</xml_diff>

<commit_message>
Refine engine: active-case interview frame with consultant as the ongoing killer
Co-Authored-By: Claude Opus 4.8 (1M context) <noreply@anthropic.com>
Claude-Session: https://claude.ai/code/session_01XPJW3cWNtKJW2iRHbtxJrM
</commit_message>
<xml_diff>
--- a/The-Prison-Series-Story-Bible.docx
+++ b/The-Prison-Series-Story-Bible.docx
@@ -129,7 +129,7 @@
         <w:spacing w:after="140" w:line="276"/>
       </w:pPr>
       <w:r>
-        <w:t xml:space="preserve">A forensic psychologist takes a prison contract to assess and “treat” inmates and singles one out under cover of clinical interest. The inmate is a convicted serial killer — and the psychologist is fascinated, because the inmate’s work is exquisite and the man is the only mind that could ever match his own. What the reader does not learn until the midpoint is the psychologist’s secret: HE is a killer too, and his own sloppy murder — committed in the inmate’s style — is the copycat kill that handed police the pattern and put the inmate in this cage. He came partly out of obsession, partly to control the one man who could expose him. As clinical manipulation curdles into arousal, possession, and murder, the dread becomes when the inmate will find out — and when he does, the betrayal binds them instead of breaking them. The psychologist gets him out, and they vanish together: a killing pair.</w:t>
+        <w:t xml:space="preserve">A convicted serial killer sits in prison for a series of murders — all of them his, except the one he has never stopped disputing. Then the killings continue without him, in his exact signature, and a forensic psychologist is brought in to consult on the active case and interview the one man who understands the killer best. What the reader does not learn until the midpoint is the consultant’s secret: HE is the copycat. He did the disputed kill that caged the inmate, he is the one still killing now, and he engineered the interviews to sit across from the only mind that could ever match his. Each session he feeds the inmate details; the inmate — hunting his own freedom — dissects them, never realising he is profiling the man at the table. As clinical control curdles into arousal, possession, and murder, the dread becomes when the inmate will realise — and when he does, the betrayal binds them instead of breaking them. The psychologist breaks him out, and they vanish together: a killing pair.</w:t>
       </w:r>
     </w:p>
     <w:p>
@@ -258,7 +258,7 @@
         <w:spacing w:after="70" w:line="270"/>
       </w:pPr>
       <w:r>
-        <w:t xml:space="preserve">THE SECRET (held from the reader until the midpoint): his own copycat kill, done in the inmate’s style, is what gave police the pattern that caught the inmate. He is the reason the man is in a cage. He came to study him, to possess him, and to make sure he never figures it out.</w:t>
+        <w:t xml:space="preserve">THE SECRET (held from the reader until the midpoint): he is the copycat. His sloppy kill in the inmate’s style is what caught the inmate — and he is STILL killing now, using a consulting role on the active case as his cover to sit across the table from the only mind that matches his. He is courting with corpses.</w:t>
       </w:r>
     </w:p>
     <w:p>
@@ -292,7 +292,7 @@
         <w:spacing w:after="70" w:line="270"/>
       </w:pPr>
       <w:r>
-        <w:t xml:space="preserve">Convicted of a cluster of murders that includes sloppy kills the case blames on a supposed ‘partner.’ He is incensed: those clumsy murders are an insult, and they are not his work.</w:t>
+        <w:t xml:space="preserve">Did every murder he was convicted of but ONE — and has never stopped disputing that one (rightly: it is the psychologist’s). When the killings continue without him, he sees his way out: prove the copycat is real and the disputed conviction cracks. So he engages with the consultant — never realising he is profiling the man across the table.</w:t>
       </w:r>
     </w:p>
     <w:p>
@@ -368,7 +368,7 @@
         <w:spacing w:after="140" w:line="276"/>
       </w:pPr>
       <w:r>
-        <w:t xml:space="preserve">One man’s secret powers the entire book — and the reader doesn’t get it until the halfway mark. First half: a twisted clinical cat-and-mouse between two killers. Midpoint: the gut-punch. Second half: dread.</w:t>
+        <w:t xml:space="preserve">One man’s secret powers the entire book — and the reader doesn’t get it until the halfway mark. First half: two killers facing each other across an interview table in a twisted cat-and-mouse. Midpoint: the gut-punch. Second half: dread.</w:t>
       </w:r>
     </w:p>
     <w:p>
@@ -397,10 +397,10 @@
           <w:bCs/>
           <w:color w:val="7B1E22"/>
         </w:rPr>
-        <w:t xml:space="preserve">The flaw in his conviction: </w:t>
-      </w:r>
-      <w:r>
-        <w:t xml:space="preserve">He has been convicted of a cluster of murders that includes sloppy kills the prosecution pins on a supposed ‘partner’ (the terms in play: team killers / a killing dyad; the accomplice is a co-offender). The inmate is incensed — those clumsy murders are an insult to his craft, and they are not his.</w:t>
+        <w:t xml:space="preserve">The one kill he disputes: </w:t>
+      </w:r>
+      <w:r>
+        <w:t xml:space="preserve">He did every murder he was convicted of but ONE — and has never stopped insisting that one wasn’t his. He is right. That kill was sloppy, it wore his signature, and it is the one that handed police the pattern that finally caught him.</w:t>
       </w:r>
     </w:p>
     <w:p>
@@ -413,10 +413,26 @@
           <w:bCs/>
           <w:color w:val="7B1E22"/>
         </w:rPr>
+        <w:t xml:space="preserve">The hook — the killings continue: </w:t>
+      </w:r>
+      <w:r>
+        <w:t xml:space="preserve">After his conviction the murders don’t stop. Same signature. Officially: a copycat. So a forensic psychologist is brought in to consult on the active case and interview the one man who understands this killer better than anyone — the convicted killer himself. (The Mindhunter / Clarice-and-Lecter frame, flipped.)</w:t>
+      </w:r>
+    </w:p>
+    <w:p>
+      <w:pPr>
+        <w:spacing w:after="120" w:line="276"/>
+      </w:pPr>
+      <w:r>
+        <w:rPr>
+          <w:b/>
+          <w:bCs/>
+          <w:color w:val="7B1E22"/>
+        </w:rPr>
         <w:t xml:space="preserve">The hidden truth (revealed to the reader at the MIDPOINT): </w:t>
       </w:r>
       <w:r>
-        <w:t xml:space="preserve">The psychologist did them. He is a killer too, messier than he admits, working in the inmate’s style — and his sloppy copycat kill, wearing the inmate’s signature, is what handed police the pattern that finally caught the inmate. The man is caged because of the psychologist’s mess. He came to study the artistry he stole, to possess the only mind that matches his, and to control the one person who could expose him.</w:t>
+        <w:t xml:space="preserve">The consultant is the killer. He did the disputed kill that caged the inmate, and he is the one still killing now. He engineered the consulting role to sit across from the only mind that matches his — and he keeps killing partly because he cannot stop, and partly because each new body is another reason to come back. He is courting with corpses.</w:t>
       </w:r>
     </w:p>
     <w:p>
@@ -429,10 +445,26 @@
           <w:bCs/>
           <w:color w:val="7B1E22"/>
         </w:rPr>
+        <w:t xml:space="preserve">What’s in it for the inmate: </w:t>
+      </w:r>
+      <w:r>
+        <w:t xml:space="preserve">He engages because the ongoing murders are his way out: if a copycat is provably still active, the disputed conviction cracks and reasonable doubt bleeds into the rest. Every session he thinks he is profiling his way to freedom. He does not realise he is profiling the man across the table.</w:t>
+      </w:r>
+    </w:p>
+    <w:p>
+      <w:pPr>
+        <w:spacing w:after="120" w:line="276"/>
+      </w:pPr>
+      <w:r>
+        <w:rPr>
+          <w:b/>
+          <w:bCs/>
+          <w:color w:val="7B1E22"/>
+        </w:rPr>
         <w:t xml:space="preserve">The scene the whole book is built around: </w:t>
       </w:r>
       <w:r>
-        <w:t xml:space="preserve">The psychologist slides crime-scene photos of his OWN kills across the table. The inmate, not knowing they are the psychologist’s, coldly dissects them — devastated that his name is on such trash, contemptuous of the amateur who did them — while the psychologist sits there undone: aroused at being seen, judged, and matched by the only person alive who could.</w:t>
+        <w:t xml:space="preserve">Each session the psychologist brings the latest case — photos, details, the freshest kill. The inmate coldly dissects the work… and slowly the reader sees what the inmate can’t yet: the consultant knows too much, the details are too first-hand, the new kills track the inmate’s own tastes too perfectly. The interview table is a courtship and a confession in plain sight.</w:t>
       </w:r>
     </w:p>
     <w:p>
@@ -448,7 +480,7 @@
         <w:t xml:space="preserve">The midpoint gut-punch &amp; the dread: </w:t>
       </w:r>
       <w:r>
-        <w:t xml:space="preserve">The reader learns the truth at the halfway mark, and every prior scene recolours. The back half becomes one question — when will the inmate find out — and what the psychologist will do to stop it.</w:t>
+        <w:t xml:space="preserve">The reader’s suspicion hardens into certainty at the halfway mark, and every prior session recolours. The back half becomes one question — when will the inmate realise — and what the psychologist will do to keep him from it.</w:t>
       </w:r>
     </w:p>
     <w:p>
@@ -464,7 +496,7 @@
         <w:t xml:space="preserve">The black moment (Act 4): </w:t>
       </w:r>
       <w:r>
-        <w:t xml:space="preserve">The inmate finds out: the man feeding, protecting, and obsessing over him is the reason he is in a cage. Rage, betrayal — and then, because they are the same animal, the betrayal curdles into the deepest intimacy either has known. He is the only one who ever truly saw me.</w:t>
+        <w:t xml:space="preserve">The inmate realises: the man feeding him details, courting him, promising him a way out, is the killer — the reason he is caged. Rage, betrayal — and then, because they are the same animal, it curdles into the deepest intimacy either has known. He is the only one who ever truly saw me, and he has been killing to sit across from me.</w:t>
       </w:r>
     </w:p>
     <w:p>
@@ -492,7 +524,7 @@
           <w:i/>
           <w:iCs/>
         </w:rPr>
-        <w:t xml:space="preserve">This single secret gives you: enemies-to-lovers, kindred-monster chemistry, the midpoint sucker-punch, a built-in betrayal black moment, and a detective / manhunt to power the series.</w:t>
+        <w:t xml:space="preserve">This single secret gives you: enemies-to-lovers, kindred-monster chemistry, a legitimate reason for endless sessions, the midpoint sucker-punch, a built-in betrayal black moment, and a detective / manhunt to power the series.</w:t>
       </w:r>
     </w:p>
     <w:p>
@@ -508,7 +540,7 @@
         <w:spacing w:after="140" w:line="276"/>
       </w:pPr>
       <w:r>
-        <w:t xml:space="preserve">Here’s the fix for the part you’re stuck on. The mistake is imagining the psychologist “running a unit.” He doesn’t — and he doesn’t need to. A forensic psychologist’s real power is narrative: he writes the report that decides what kind of prisoner the inmate is, and that paperwork physically relocates the inmate into environments with progressively fewer witnesses and more clinical control. The “forensic unit” isn’t a place he commands; it’s the destination his diagnoses engineer.</w:t>
+        <w:t xml:space="preserve">Here’s the fix for the part you’re stuck on. The mistake is imagining the psychologist “running a unit.” He doesn’t — and he doesn’t need to. He gets through the door as an outside consultant on the active killings (that’s his ticket), then converts the rapport into a clinical role over the inmate. From there, a forensic psychologist’s real power is narrative: he writes the report that decides what kind of prisoner the inmate is, and that paperwork physically relocates the inmate into environments with progressively fewer witnesses and more clinical control. The “forensic unit” isn’t a place he commands; it’s the destination his diagnoses engineer.</w:t>
       </w:r>
     </w:p>
     <w:p>
@@ -593,7 +625,7 @@
         <w:spacing w:after="70" w:line="270"/>
       </w:pPr>
       <w:r>
-        <w:t xml:space="preserve">General population. The inmate is one among many; the psychologist has only scheduled sessions. Surveillance, distance, the long game.</w:t>
+        <w:t xml:space="preserve">General population. He arrives as an outside consultant on the active killings, with only scheduled interview sessions — surveillance, distance, the long game. His first task is to convert that consulting access into a standing clinical role.</w:t>
       </w:r>
     </w:p>
     <w:p>
@@ -703,15 +735,15 @@
         <w:spacing w:after="70" w:line="270"/>
       </w:pPr>
       <w:r>
-        <w:t xml:space="preserve">The psychologist arrives on contract, secret intact. He controls the inmate’s evaluation, meds, segregation, and prospects. </w:t>
-      </w:r>
-      <w:r>
-        <w:rPr>
-          <w:b/>
-          <w:bCs/>
-          <w:color w:val="7B1E22"/>
-        </w:rPr>
-        <w:t xml:space="preserve">[Authority Figure]</w:t>
+        <w:t xml:space="preserve">The psychologist arrives as an outside consultant on the continuing murders — brought in to interview the convicted killer about the ‘copycat.’ Secret intact. </w:t>
+      </w:r>
+      <w:r>
+        <w:rPr>
+          <w:b/>
+          <w:bCs/>
+          <w:color w:val="7B1E22"/>
+        </w:rPr>
+        <w:t xml:space="preserve">[Authority Figure / Mindhunter frame]</w:t>
       </w:r>
     </w:p>
     <w:p>
@@ -745,7 +777,49 @@
         <w:spacing w:after="70" w:line="270"/>
       </w:pPr>
       <w:r>
-        <w:t xml:space="preserve">The psychologist’s ‘due diligence’ becomes obsession: files, scene photos, the man’s whole history, after-hours study. The investigation IS the stalking — and it lets him relive the work he envies. </w:t>
+        <w:t xml:space="preserve">The inmate names his price (‘what’s in it for me’): the ongoing kills could prove a copycat and crack his disputed conviction. He agrees to profile — hunting his own freedom. </w:t>
+      </w:r>
+      <w:r>
+        <w:rPr>
+          <w:b/>
+          <w:bCs/>
+          <w:color w:val="7B1E22"/>
+        </w:rPr>
+        <w:t xml:space="preserve">[The hook / inmate’s motive]</w:t>
+      </w:r>
+    </w:p>
+    <w:p>
+      <w:pPr>
+        <w:pStyle w:val="ListParagraph"/>
+        <w:numPr>
+          <w:ilvl w:val="0"/>
+          <w:numId w:val="2"/>
+        </w:numPr>
+        <w:spacing w:after="70" w:line="270"/>
+      </w:pPr>
+      <w:r>
+        <w:t xml:space="preserve">Seed the case mystery: the one murder the inmate swears wasn’t his, and the bodies still dropping in his signature. The reader files it as a copycat hunt — not knowing the hunter is the consultant. </w:t>
+      </w:r>
+      <w:r>
+        <w:rPr>
+          <w:b/>
+          <w:bCs/>
+          <w:color w:val="7B1E22"/>
+        </w:rPr>
+        <w:t xml:space="preserve">[Mystery seed — for the midpoint]</w:t>
+      </w:r>
+    </w:p>
+    <w:p>
+      <w:pPr>
+        <w:pStyle w:val="ListParagraph"/>
+        <w:numPr>
+          <w:ilvl w:val="0"/>
+          <w:numId w:val="2"/>
+        </w:numPr>
+        <w:spacing w:after="70" w:line="270"/>
+      </w:pPr>
+      <w:r>
+        <w:t xml:space="preserve">His ‘due diligence’ becomes obsession: files, scene photos, the man’s whole history, after-hours study. The investigation IS the stalking — and it lets him relive his own work. </w:t>
       </w:r>
       <w:r>
         <w:rPr>
@@ -766,15 +840,15 @@
         <w:spacing w:after="70" w:line="270"/>
       </w:pPr>
       <w:r>
-        <w:t xml:space="preserve">Seed the misattributed kills as an external mystery: the ‘partner’ murders the inmate swears aren’t his. The reader files it as the inmate’s denial — not knowing it’s the truth. </w:t>
-      </w:r>
-      <w:r>
-        <w:rPr>
-          <w:b/>
-          <w:bCs/>
-          <w:color w:val="7B1E22"/>
-        </w:rPr>
-        <w:t xml:space="preserve">[Mystery seed — for the midpoint]</w:t>
+        <w:t xml:space="preserve">He leverages the rapport and the inmate’s ‘deterioration’ to get himself appointed to assess and manage him — converting a consulting gig into clinical control. </w:t>
+      </w:r>
+      <w:r>
+        <w:rPr>
+          <w:b/>
+          <w:bCs/>
+          <w:color w:val="7B1E22"/>
+        </w:rPr>
+        <w:t xml:space="preserve">[Authority escalation]</w:t>
       </w:r>
     </w:p>
     <w:p>
@@ -1357,7 +1431,7 @@
                 <w:bCs w:val="false"/>
                 <w:color w:val="000000"/>
               </w:rPr>
-              <w:t xml:space="preserve">Premise — the psychologist controls evaluation, meds, segregation, prospects (Act 1 onward).</w:t>
+              <w:t xml:space="preserve">Arrives as consultant on the active case, then converts rapport into clinical control over meds, segregation, prospects (Act 1 onward).</w:t>
             </w:r>
           </w:p>
         </w:tc>

</xml_diff>